<commit_message>
Veto-Prüfung: Übermittlung per E-Mail an CADIS-Fachbereich, Verweis auf Mailvorlagen
Co-Authored-By: Claude Sonnet 5.5 <noreply@anthropic.com>
Claude-Session: https://claude.ai/code/session_01WyvNodyyJRof1fHMN8ju4o
</commit_message>
<xml_diff>
--- a/CADIS_Prozessbeschreibung_bereinigt.docx
+++ b/CADIS_Prozessbeschreibung_bereinigt.docx
@@ -7306,7 +7306,7 @@
       </w:pPr>
       <w:r>
         <w:rPr/>
-        <w:t>Unterlagen für die Veto-Prüfung: Vor der Qualitätssicherung des Prüfberichts lädt der Auditor folgende Unterlagen hoch: a) den ausgefüllten CADIS®-Prüfkatalog, b) die JSON-Datei aus dem CADIS®-Audittool, c) das Kick-Off-Material, d) die Bestätigungsmail.</w:t>
+        <w:t>Unterlagen für die Veto-Prüfung: Vor der Qualitätssicherung des Prüfberichts übermittelt der Auditor folgende Unterlagen per E-Mail an den CADIS®-Fachbereich (CADIS@dekra.com): a) den ausgefüllten CADIS®-Prüfkatalog, b) die JSON-Datei aus dem CADIS®-Audittool, c) das Kick-Off-Material, d) die Bestätigungsmail (gemäß den CADIS®-Mailvorlagen).</w:t>
       </w:r>
     </w:p>
     <w:p>
@@ -8568,7 +8568,7 @@
       </w:pPr>
       <w:r>
         <w:rPr/>
-        <w:t>Der CADIS®-Fachbereich erstellt den Bericht zur Überwachungsprüfung auf Basis der Bewertung des Auditors, führt die Qualitätssicherung durch, meldet das Ergebnis in die CADIS®-Datenbank und aktualisiert den Freigabestatus. Wurden Abweichungen festgestellt, ist – wie bei der Erstprüfung – ein vorliegender und freigegebener Maßnahmenplan nach Kapitel 4.2 Voraussetzung für die Erstellung des Berichts; er entfällt nur, wenn das geprüfte Unternehmen ausdrücklich keine temporäre Freigabe anstrebt und keine kritische Abweichung festgestellt wurde. Die Unterlagen für die Veto-Prüfung sind entsprechend Schritt 11 hochzuladen.</w:t>
+        <w:t>Der CADIS®-Fachbereich erstellt den Bericht zur Überwachungsprüfung auf Basis der Bewertung des Auditors, führt die Qualitätssicherung durch, meldet das Ergebnis in die CADIS®-Datenbank und aktualisiert den Freigabestatus. Wurden Abweichungen festgestellt, ist – wie bei der Erstprüfung – ein vorliegender und freigegebener Maßnahmenplan nach Kapitel 4.2 Voraussetzung für die Erstellung des Berichts; er entfällt nur, wenn das geprüfte Unternehmen ausdrücklich keine temporäre Freigabe anstrebt und keine kritische Abweichung festgestellt wurde. Die Unterlagen für die Veto-Prüfung sind entsprechend Schritt 11 zu übermitteln.</w:t>
       </w:r>
     </w:p>
     <w:p>
@@ -8866,7 +8866,7 @@
       </w:pPr>
       <w:r>
         <w:rPr/>
-        <w:t>Der CADIS®-Fachbereich erstellt den Bericht zur Erweiterungsprüfung auf Basis der Bewertung des Auditors und aktualisiert den Prüfscope und den Freigabestatus in der CADIS®-Datenbank. Wurden Abweichungen festgestellt, ist ein vorliegender und freigegebener Maßnahmenplan nach Kapitel 4.2 Voraussetzung für die Erstellung des Berichts. Die Unterlagen für die Veto-Prüfung sind entsprechend Schritt 11 hochzuladen.</w:t>
+        <w:t>Der CADIS®-Fachbereich erstellt den Bericht zur Erweiterungsprüfung auf Basis der Bewertung des Auditors und aktualisiert den Prüfscope und den Freigabestatus in der CADIS®-Datenbank. Wurden Abweichungen festgestellt, ist ein vorliegender und freigegebener Maßnahmenplan nach Kapitel 4.2 Voraussetzung für die Erstellung des Berichts. Die Unterlagen für die Veto-Prüfung sind entsprechend Schritt 11 zu übermitteln.</w:t>
       </w:r>
     </w:p>
     <w:p>

</xml_diff>

<commit_message>
Kapitel 2.3 Zusammenarbeit im Auditteam ergänzt
Co-Authored-By: Claude Sonnet 5.5 <noreply@anthropic.com>
Claude-Session: https://claude.ai/code/session_01WyvNodyyJRof1fHMN8ju4o
</commit_message>
<xml_diff>
--- a/CADIS_Prozessbeschreibung_bereinigt.docx
+++ b/CADIS_Prozessbeschreibung_bereinigt.docx
@@ -13,7 +13,7 @@
         <mc:AlternateContent>
           <mc:Choice Requires="wps">
             <w:drawing>
-              <wp:anchor behindDoc="1" distT="0" distB="0" distL="0" distR="0" simplePos="0" locked="0" layoutInCell="0" allowOverlap="1" relativeHeight="59" wp14:anchorId="2A1C405D">
+              <wp:anchor behindDoc="1" distT="0" distB="0" distL="0" distR="0" simplePos="0" locked="0" layoutInCell="0" allowOverlap="1" relativeHeight="61" wp14:anchorId="2A1C405D">
                 <wp:simplePos x="0" y="0"/>
                 <wp:positionH relativeFrom="page">
                   <wp:posOffset>5334000</wp:posOffset>
@@ -88,7 +88,7 @@
         <mc:AlternateContent>
           <mc:Choice Requires="wps">
             <w:drawing>
-              <wp:anchor behindDoc="1" distT="0" distB="0" distL="0" distR="0" simplePos="0" locked="0" layoutInCell="0" allowOverlap="1" relativeHeight="60" wp14:anchorId="14500869">
+              <wp:anchor behindDoc="1" distT="0" distB="0" distL="0" distR="0" simplePos="0" locked="0" layoutInCell="0" allowOverlap="1" relativeHeight="62" wp14:anchorId="14500869">
                 <wp:simplePos x="0" y="0"/>
                 <wp:positionH relativeFrom="page">
                   <wp:posOffset>6223000</wp:posOffset>
@@ -147,7 +147,7 @@
         <mc:AlternateContent>
           <mc:Choice Requires="wps">
             <w:drawing>
-              <wp:anchor behindDoc="1" distT="0" distB="0" distL="0" distR="0" simplePos="0" locked="0" layoutInCell="0" allowOverlap="1" relativeHeight="61" wp14:anchorId="2EB9B489">
+              <wp:anchor behindDoc="1" distT="0" distB="0" distL="0" distR="0" simplePos="0" locked="0" layoutInCell="0" allowOverlap="1" relativeHeight="63" wp14:anchorId="2EB9B489">
                 <wp:simplePos x="0" y="0"/>
                 <wp:positionH relativeFrom="page">
                   <wp:posOffset>7112000</wp:posOffset>
@@ -5286,6 +5286,145 @@
     </w:p>
     <w:p>
       <w:pPr>
+        <w:pStyle w:val="Heading2"/>
+        <w:rPr/>
+      </w:pPr>
+      <w:r>
+        <w:rPr/>
+        <w:t>2.3 Zusammenarbeit im Auditteam</w:t>
+      </w:r>
+    </w:p>
+    <w:p>
+      <w:pPr>
+        <w:pStyle w:val="Textkrper1"/>
+        <w:rPr/>
+      </w:pPr>
+      <w:r>
+        <w:rPr/>
+        <w:t>Wird ein Auditteam gebildet, gelten für die Zusammenarbeit die folgenden Regeln.</w:t>
+      </w:r>
+    </w:p>
+    <w:p>
+      <w:pPr>
+        <w:pStyle w:val="Textkrper1"/>
+        <w:rPr/>
+      </w:pPr>
+      <w:r>
+        <w:rPr>
+          <w:b/>
+          <w:bCs/>
+        </w:rPr>
+        <w:t xml:space="preserve">Rollen im Team: </w:t>
+      </w:r>
+      <w:r>
+        <w:rPr/>
+        <w:t>Der Lead Auditor verantwortet die Gesamtprüfung, koordiniert das Auditteam und ist alleiniger Ansprechpartner für das geprüfte Unternehmen und den CADIS®-Fachbereich. Weitere Auditoren und Fachexperten prüfen die ihnen zugewiesenen Prüfmodule eigenverantwortlich und berichten an den Lead Auditor. Der CADIS®-Fachbereich benennt den Lead Auditor bei der Auditorzuweisung (Schritt 02).</w:t>
+      </w:r>
+    </w:p>
+    <w:p>
+      <w:pPr>
+        <w:pStyle w:val="Textkrper1"/>
+        <w:rPr/>
+      </w:pPr>
+      <w:r>
+        <w:rPr>
+          <w:b/>
+          <w:bCs/>
+        </w:rPr>
+        <w:t xml:space="preserve">Aufteilung der Prüfmodule: </w:t>
+      </w:r>
+      <w:r>
+        <w:rPr/>
+        <w:t>Der Lead Auditor erstellt eine Modulzuordnung, aus der hervorgeht, welcher Auditor welche Prüfmodule je Standort und Level of Examination prüft. Jeder Auditor wird nur für Prüfmodule eingesetzt, für die er nach CADIS®-Handbuch, Kapitel 5.2, qualifiziert ist; jedes Prüfmodul hat genau einen verantwortlichen Auditor. Die Modulzuordnung wird dem CADIS®-Fachbereich zur Kenntnis gegeben, im Kick-Off (Schritt 04) dem geprüften Unternehmen vorgestellt und ist Bestandteil der Auditdokumentation.</w:t>
+      </w:r>
+    </w:p>
+    <w:p>
+      <w:pPr>
+        <w:pStyle w:val="Textkrper1"/>
+        <w:rPr/>
+      </w:pPr>
+      <w:r>
+        <w:rPr>
+          <w:b/>
+          <w:bCs/>
+        </w:rPr>
+        <w:t xml:space="preserve">Abstimmung während der Prüfung: </w:t>
+      </w:r>
+      <w:r>
+        <w:rPr/>
+        <w:t>Das Auditteam stimmt sich vor Phase 1, vor Phase 2 und am Ende der Phase 2 zur Vorbereitung des Closing Meetings ab. Querschnittsthemen werden gemeinsam bewertet, damit Reifegrade und Feststellungen über alle Prüfmodule hinweg konsistent sind.</w:t>
+      </w:r>
+    </w:p>
+    <w:p>
+      <w:pPr>
+        <w:pStyle w:val="Textkrper1"/>
+        <w:rPr/>
+      </w:pPr>
+      <w:r>
+        <w:rPr>
+          <w:b/>
+          <w:bCs/>
+        </w:rPr>
+        <w:t xml:space="preserve">Konsolidierung und Entscheidung: </w:t>
+      </w:r>
+      <w:r>
+        <w:rPr/>
+        <w:t>Der Lead Auditor führt die modulweisen Bewertungen im CADIS®-Audittool zusammen, prüft sie vor dem Closing Meeting auf Plausibilität über alle Prüfmodule hinweg und ermittelt den Security Score. Bei abweichenden Einschätzungen entscheidet der Lead Auditor nach Rücksprache mit den beteiligten Auditoren; bleibt der Dissens bestehen, wird der CADIS®-Fachbereich eingebunden. Die Einstufung als kritische Abweichung sowie eine Herabstufung nach Schritt F-03 werden im Team abgestimmt und vom Lead Auditor dokumentiert.</w:t>
+      </w:r>
+    </w:p>
+    <w:p>
+      <w:pPr>
+        <w:pStyle w:val="Textkrper1"/>
+        <w:rPr/>
+      </w:pPr>
+      <w:r>
+        <w:rPr>
+          <w:b/>
+          <w:bCs/>
+        </w:rPr>
+        <w:t xml:space="preserve">Kommunikation nach außen: </w:t>
+      </w:r>
+      <w:r>
+        <w:rPr/>
+        <w:t>Das geprüfte Unternehmen kommuniziert ausschließlich mit dem Lead Auditor; Feststellungen werden nur durch den Lead Auditor mitgeteilt. Der Lead Auditor führt das Closing Meeting; die modulverantwortlichen Auditoren nehmen teil, soweit ihre Prüfmodule betroffen sind.</w:t>
+      </w:r>
+    </w:p>
+    <w:p>
+      <w:pPr>
+        <w:pStyle w:val="Textkrper1"/>
+        <w:rPr/>
+      </w:pPr>
+      <w:r>
+        <w:rPr>
+          <w:b/>
+          <w:bCs/>
+        </w:rPr>
+        <w:t xml:space="preserve">Maßnahmenplan und Unterlagen: </w:t>
+      </w:r>
+      <w:r>
+        <w:rPr/>
+        <w:t>Die Maßnahmenplanbewertung erfolgt durch den Lead Auditor mit Zuarbeit der modulverantwortlichen Auditoren. Die Unterlagen für die Veto-Prüfung beziehungsweise bei Auditabbruch übermittelt der Lead Auditor (Schritt 11, Schritt 07).</w:t>
+      </w:r>
+    </w:p>
+    <w:p>
+      <w:pPr>
+        <w:pStyle w:val="Textkrper1"/>
+        <w:rPr/>
+      </w:pPr>
+      <w:r>
+        <w:rPr>
+          <w:b/>
+          <w:bCs/>
+        </w:rPr>
+        <w:t xml:space="preserve">Folgeprüfungen und Ausfall: </w:t>
+      </w:r>
+      <w:r>
+        <w:rPr/>
+        <w:t>Follow-Up, Überwachungsprüfung und Erweiterungsprüfung werden nach Möglichkeit vom Auditteam der zugrunde liegenden Prüfung durchgeführt; Abweichungen sind dem CADIS®-Fachbereich zu melden. Fällt ein Teammitglied während der Prüfung aus, weist der CADIS®-Fachbereich einen Ersatz zu, und der Lead Auditor übergibt die Arbeitsstände; fällt der Lead Auditor aus, bestimmt der CADIS®-Fachbereich einen neuen Lead Auditor.</w:t>
+      </w:r>
+    </w:p>
+    <w:p>
+      <w:pPr>
         <w:pStyle w:val="Heading1"/>
         <w:rPr/>
       </w:pPr>
@@ -6823,7 +6962,7 @@
       </w:pPr>
       <w:r>
         <w:rPr/>
-        <w:t>Das zu prüfende Unternehmen beauftragt die Prüfung beim CADIS®-Fachbereich. Der Fachbereich nimmt den Auftrag an, prüft den Scope-Entwurf auf Vollständigkeit und Plausibilität und weist einen Auditor zu. Deckt ein einzelner Auditor nicht alle Prüfmodule ab, wird ein Auditteam zusammengestellt. Der Fachbereich koordiniert den zeitlichen Rahmen der Prüfung mit dem Unternehmen und legt den Vorgang in der CADIS®-Datenbank an.</w:t>
+        <w:t>Das zu prüfende Unternehmen beauftragt die Prüfung beim CADIS®-Fachbereich. Der Fachbereich nimmt den Auftrag an, prüft den Scope-Entwurf auf Vollständigkeit und Plausibilität und weist einen Auditor zu. Deckt ein einzelner Auditor nicht alle Prüfmodule ab, wird ein Auditteam zusammengestellt. Der Fachbereich koordiniert den zeitlichen Rahmen der Prüfung mit dem Unternehmen und legt den Vorgang in der CADIS®-Datenbank an. Bei einem Auditteam benennt der CADIS®-Fachbereich einen Lead Auditor (Kapitel 2.3).</w:t>
       </w:r>
     </w:p>
     <w:p>
@@ -6919,7 +7058,7 @@
       </w:pPr>
       <w:r>
         <w:rPr/>
-        <w:t>Die Ergebnisse des Kick-Offs sind schriftlich zu dokumentieren. Das Kick-Off ist so zu terminieren, dass zwischen seinem Abschluss und der ersten Einreichung der Phase 1 mindestens 14 Kalendertage liegen.</w:t>
+        <w:t>Die Ergebnisse des Kick-Offs sind schriftlich zu dokumentieren. Das Kick-Off ist so zu terminieren, dass zwischen seinem Abschluss und der ersten Einreichung der Phase 1 mindestens 14 Kalendertage liegen. Bei einem Auditteam werden im Kick-Off das Team, der Lead Auditor und die Modulzuordnung vorgestellt (Kapitel 2.3).</w:t>
       </w:r>
     </w:p>
     <w:p>
@@ -6955,7 +7094,7 @@
       </w:pPr>
       <w:r>
         <w:rPr/>
-        <w:t>Der Entwurf der Prüfagenda wird vom Auditor nach Schritt 03 und vor dem Kick-Off erstellt und im Kick-Off (Schritt 04 f) abgestimmt. Dieser Schritt umfasst die Anpassung und Bestätigung der finalen Agenda. Der Auditor erstellt bereits vor dem Kick-Off auf Basis des Scope-Entwurfs und des beauftragten Level of Examination einen Entwurf der Prüfagenda und ermittelt die erforderliche Auditzeit (CADIS® Auditplan Generator). Der Entwurf wird im Kick-Off abgestimmt und bestätigt (Schritt 04 f). Ergeben sich im Kick-Off Änderungen, passt der Auditor die Agenda unverzüglich an und übermittelt sie dem geprüften Unternehmen erneut. Die Agenda benennt Prüfabschnitte, Zeitfenster, erforderliche Ansprechpartner und – bei LoE 3 – Begehungsbereiche. Eine Agenda ist ausschließlich für Prüfungen der Stufen LoE 2 und LoE 3 zu erstellen; für LoE 1 entfällt diese Anforderung. Die Agenda ist Bestandteil der Prüfdokumentation.</w:t>
+        <w:t>Der Entwurf der Prüfagenda wird vom Auditor nach Schritt 03 und vor dem Kick-Off erstellt und im Kick-Off (Schritt 04 f) abgestimmt. Dieser Schritt umfasst die Anpassung und Bestätigung der finalen Agenda. Der Auditor erstellt bereits vor dem Kick-Off auf Basis des Scope-Entwurfs und des beauftragten Level of Examination einen Entwurf der Prüfagenda und ermittelt die erforderliche Auditzeit (CADIS® Auditplan Generator). Der Entwurf wird im Kick-Off abgestimmt und bestätigt (Schritt 04 f). Ergeben sich im Kick-Off Änderungen, passt der Auditor die Agenda unverzüglich an und übermittelt sie dem geprüften Unternehmen erneut. Die Agenda benennt Prüfabschnitte, Zeitfenster, erforderliche Ansprechpartner und – bei LoE 3 – Begehungsbereiche. Eine Agenda ist ausschließlich für Prüfungen der Stufen LoE 2 und LoE 3 zu erstellen; für LoE 1 entfällt diese Anforderung. Die Agenda ist Bestandteil der Prüfdokumentation. Bei einem Auditteam berücksichtigt die Agenda die Einsatzzeiten der Teammitglieder je Prüfmodul.</w:t>
       </w:r>
     </w:p>
     <w:p>
@@ -7073,7 +7212,7 @@
       </w:pPr>
       <w:r>
         <w:rPr/>
-        <w:t>Auf Grundlage der Erkenntnisse entscheidet der Auditor, ob die Prüfung im geplanten Umfang fortgeführt, verschoben oder in Ausnahmefällen abgebrochen wird. Bei negativem Ergebnis wird das Unternehmen zur Nachbesserung aufgefordert. Insgesamt stehen maximal drei Einreichungsversuche zur Verfügung; als Einreichungsversuch gilt jede formale Übermittlung des Prüfkatalogs an den Auditor. Nach dem dritten erfolglosen Versuch ist die Prüfung abzubrechen. Weitere Abbruchgründe, die Folgen eines Abbruchs sowie die Regeln zur Verschiebung sind im CADIS®-Handbuch, Kapitel 6.13, festgelegt. Bei jedem Auditabbruch übermittelt der Auditor die bis dahin vorliegenden Unterlagen (ausgefüllter CADIS®-Prüfkatalog, JSON-Datei aus dem CADIS®-Audittool, Kick-Off-Material, Bestätigungsmail gemäß den CADIS®-Mailvorlagen) per E-Mail an den CADIS®-Fachbereich (CADIS@dekra.com); dieser entscheidet über das weitere Vorgehen.</w:t>
+        <w:t>Auf Grundlage der Erkenntnisse entscheidet der Auditor, ob die Prüfung im geplanten Umfang fortgeführt, verschoben oder in Ausnahmefällen abgebrochen wird. Bei negativem Ergebnis wird das Unternehmen zur Nachbesserung aufgefordert. Insgesamt stehen maximal drei Einreichungsversuche zur Verfügung; als Einreichungsversuch gilt jede formale Übermittlung des Prüfkatalogs an den Auditor. Nach dem dritten erfolglosen Versuch ist die Prüfung abzubrechen. Weitere Abbruchgründe, die Folgen eines Abbruchs sowie die Regeln zur Verschiebung sind im CADIS®-Handbuch, Kapitel 6.13, festgelegt. Bei jedem Auditabbruch übermittelt der Auditor (bei einem Auditteam: der Lead Auditor) die bis dahin vorliegenden Unterlagen (ausgefüllter CADIS®-Prüfkatalog, JSON-Datei aus dem CADIS®-Audittool, Kick-Off-Material, Bestätigungsmail gemäß den CADIS®-Mailvorlagen) per E-Mail an den CADIS®-Fachbereich (CADIS@dekra.com); dieser entscheidet über das weitere Vorgehen.</w:t>
       </w:r>
     </w:p>
     <w:p>
@@ -7208,7 +7347,7 @@
       </w:pPr>
       <w:r>
         <w:rPr/>
-        <w:t>Der Auditor bewertet jeden Prüfpunkt im Scope und dokumentiert das Ergebnis im CADIS®-Audittool. Für jede Prüffrage wird der Reifegrad bestätigt oder korrigiert; Abweichungen werden als kritische Abweichung, nicht kritische Abweichung oder Beobachtung erfasst, konforme Prüfpunkte werden als solche dokumentiert. Auf dieser Grundlage wird der Security Score berechnet und das Gesamtergebnis gemäß Kapitel 6.3 eingestuft.</w:t>
+        <w:t>Der Auditor bewertet jeden Prüfpunkt im Scope und dokumentiert das Ergebnis im CADIS®-Audittool. Für jede Prüffrage wird der Reifegrad bestätigt oder korrigiert; Abweichungen werden als kritische Abweichung, nicht kritische Abweichung oder Beobachtung erfasst, konforme Prüfpunkte werden als solche dokumentiert. Auf dieser Grundlage wird der Security Score berechnet und das Gesamtergebnis gemäß Kapitel 6.3 eingestuft. Bei einem Auditteam konsolidiert der Lead Auditor die modulweisen Bewertungen und den Security Score (Kapitel 2.3).</w:t>
       </w:r>
     </w:p>
     <w:p>
@@ -7260,7 +7399,7 @@
       </w:pPr>
       <w:r>
         <w:rPr/>
-        <w:t>Das im Closing Meeting vorgestellte Ergebnis ist vorläufig; verbindlich wird es mit dem Prüfbericht.</w:t>
+        <w:t>Das im Closing Meeting vorgestellte Ergebnis ist vorläufig; verbindlich wird es mit dem Prüfbericht. Bei einem Auditteam führt der Lead Auditor das Closing Meeting (Kapitel 2.3).</w:t>
       </w:r>
     </w:p>
     <w:p>
@@ -7306,7 +7445,7 @@
       </w:pPr>
       <w:r>
         <w:rPr/>
-        <w:t>Unterlagen für die Veto-Prüfung: Vor der Qualitätssicherung des Prüfberichts übermittelt der Auditor folgende Unterlagen per E-Mail an den CADIS®-Fachbereich (CADIS@dekra.com): a) den ausgefüllten CADIS®-Prüfkatalog, b) die JSON-Datei aus dem CADIS®-Audittool, c) das Kick-Off-Material, d) die Bestätigungsmail (gemäß den CADIS®-Mailvorlagen).</w:t>
+        <w:t>Unterlagen für die Veto-Prüfung: Vor der Qualitätssicherung des Prüfberichts übermittelt der Auditor (bei einem Auditteam: der Lead Auditor) folgende Unterlagen per E-Mail an den CADIS®-Fachbereich (CADIS@dekra.com): a) den ausgefüllten CADIS®-Prüfkatalog, b) die JSON-Datei aus dem CADIS®-Audittool, c) das Kick-Off-Material, d) die Bestätigungsmail (gemäß den CADIS®-Mailvorlagen).</w:t>
       </w:r>
     </w:p>
     <w:p>
@@ -7548,7 +7687,7 @@
       </w:pPr>
       <w:r>
         <w:rPr/>
-        <w:t>Die Bewertung erfolgt durch denselben Auditor, der die zugrunde liegende Prüfung durchgeführt hat.</w:t>
+        <w:t>Die Bewertung erfolgt durch denselben Auditor, der die zugrunde liegende Prüfung durchgeführt hat. Bei einem Auditteam erfolgt die Bewertung durch den Lead Auditor mit Zuarbeit der modulverantwortlichen Auditoren (Kapitel 2.3).</w:t>
       </w:r>
     </w:p>
     <w:p>
@@ -10411,7 +10550,7 @@
                   <w:rFonts w:eastAsia="Noto Sans" w:cs=""/>
                   <w:lang w:val="de-DE" w:eastAsia="en-US" w:bidi="ar-SA"/>
                 </w:rPr>
-                <w:t>27</w:t>
+                <w:t>28</w:t>
               </w:r>
               <w:r>
                 <w:rPr>
@@ -10459,7 +10598,7 @@
                   <w:rFonts w:eastAsia="Noto Sans" w:cs=""/>
                   <w:lang w:val="de-DE" w:eastAsia="en-US" w:bidi="ar-SA"/>
                 </w:rPr>
-                <w:t>27</w:t>
+                <w:t>28</w:t>
               </w:r>
               <w:r>
                 <w:rPr>
@@ -10553,7 +10692,7 @@
     <w:r>
       <w:rPr/>
       <w:drawing>
-        <wp:anchor behindDoc="1" distT="0" distB="0" distL="0" distR="0" simplePos="0" locked="0" layoutInCell="0" allowOverlap="1" relativeHeight="31">
+        <wp:anchor behindDoc="1" distT="0" distB="0" distL="0" distR="0" simplePos="0" locked="0" layoutInCell="0" allowOverlap="1" relativeHeight="32">
           <wp:simplePos x="0" y="0"/>
           <wp:positionH relativeFrom="page">
             <wp:posOffset>-342265</wp:posOffset>
@@ -10598,7 +10737,7 @@
         </wp:anchor>
       </w:drawing>
       <w:drawing>
-        <wp:anchor behindDoc="1" distT="0" distB="0" distL="0" distR="0" simplePos="0" locked="0" layoutInCell="0" allowOverlap="1" relativeHeight="58">
+        <wp:anchor behindDoc="1" distT="0" distB="0" distL="0" distR="0" simplePos="0" locked="0" layoutInCell="0" allowOverlap="1" relativeHeight="60">
           <wp:simplePos x="0" y="0"/>
           <wp:positionH relativeFrom="page">
             <wp:posOffset>5581015</wp:posOffset>

</xml_diff>

<commit_message>
Angleichung an CADIS-Handbuch (Score-Konsistenzprüfung, Freigabe, Verschiebung, LoE, Mailvorlagen)
Co-Authored-By: Claude Sonnet 5.5 <noreply@anthropic.com>
Claude-Session: https://claude.ai/code/session_01WyvNodyyJRof1fHMN8ju4o
</commit_message>
<xml_diff>
--- a/CADIS_Prozessbeschreibung_bereinigt.docx
+++ b/CADIS_Prozessbeschreibung_bereinigt.docx
@@ -5874,7 +5874,7 @@
                 <w:szCs w:val="19"/>
                 <w:lang w:val="de-DE" w:eastAsia="en-US" w:bidi="ar-SA"/>
               </w:rPr>
-              <w:t>einmalig höchstens 6 Monate; hemmt keine Fristen; bei mehr als 3 Monaten erneute Scope-Bestätigung; für die risikobasierte Überwachungsprüfung gilt ausschließlich das Toleranzfenster, eine darüber hinausgehende Verschiebung ist nicht möglich (siehe Kapitel 3.1)</w:t>
+              <w:t>einmalig höchstens 6 Monate; hemmt keine Fristen; bei mehr als 3 Monaten erneute Scope-Bestätigung; sie hemmt auch das Toleranzfenster der Überwachungsprüfung nicht (CADIS®-Handbuch, Kapitel 6.10 und 6.13)</w:t>
             </w:r>
           </w:p>
         </w:tc>
@@ -7212,7 +7212,7 @@
       </w:pPr>
       <w:r>
         <w:rPr/>
-        <w:t>Auf Grundlage der Erkenntnisse entscheidet der Auditor, ob die Prüfung im geplanten Umfang fortgeführt, verschoben oder in Ausnahmefällen abgebrochen wird. Bei negativem Ergebnis wird das Unternehmen zur Nachbesserung aufgefordert. Insgesamt stehen maximal drei Einreichungsversuche zur Verfügung; als Einreichungsversuch gilt jede formale Übermittlung des Prüfkatalogs an den Auditor. Nach dem dritten erfolglosen Versuch ist die Prüfung abzubrechen. Weitere Abbruchgründe, die Folgen eines Abbruchs sowie die Regeln zur Verschiebung sind im CADIS®-Handbuch, Kapitel 6.13, festgelegt. Bei jedem Auditabbruch übermittelt der Auditor (bei einem Auditteam: der Lead Auditor) die bis dahin vorliegenden Unterlagen (ausgefüllter CADIS®-Prüfkatalog, JSON-Datei aus dem CADIS®-Audittool, Kick-Off-Material, Bestätigungsmail gemäß den CADIS®-Mailvorlagen) per E-Mail an den CADIS®-Fachbereich (CADIS@dekra.com); dieser entscheidet über das weitere Vorgehen.</w:t>
+        <w:t>Auf Grundlage der Erkenntnisse entscheidet der Auditor, ob die Prüfung im geplanten Umfang fortgeführt, verschoben oder in Ausnahmefällen abgebrochen wird. Bei negativem Ergebnis wird das Unternehmen zur Nachbesserung aufgefordert. Insgesamt stehen maximal drei Einreichungsversuche zur Verfügung; als Einreichungsversuch gilt jede formale Übermittlung des Prüfkatalogs an den Auditor. Nach dem dritten erfolglosen Versuch ist die Prüfung abzubrechen. Weitere Abbruchgründe, die Folgen eines Abbruchs sowie die Regeln zur Verschiebung sind im CADIS®-Handbuch, Kapitel 6.13, festgelegt. Bei jedem Auditabbruch übermittelt der Auditor (bei einem Auditteam: der Lead Auditor) die bis dahin vorliegenden Unterlagen (ausgefüllter CADIS®-Prüfkatalog, JSON-Datei aus dem CADIS®-Audittool, Kick-Off-Material, Bestätigungsmail gemäß den CADIS®-Mailvorlagen, Handbuch Kapitel 14.1) per E-Mail an den CADIS®-Fachbereich (CADIS@dekra.com); dieser entscheidet über das weitere Vorgehen.</w:t>
       </w:r>
     </w:p>
     <w:p>
@@ -7445,7 +7445,7 @@
       </w:pPr>
       <w:r>
         <w:rPr/>
-        <w:t>Unterlagen für die Veto-Prüfung: Vor der Qualitätssicherung des Prüfberichts übermittelt der Auditor (bei einem Auditteam: der Lead Auditor) folgende Unterlagen per E-Mail an den CADIS®-Fachbereich (CADIS@dekra.com): a) den ausgefüllten CADIS®-Prüfkatalog, b) die JSON-Datei aus dem CADIS®-Audittool, c) das Kick-Off-Material, d) die Bestätigungsmail (gemäß den CADIS®-Mailvorlagen).</w:t>
+        <w:t>Unterlagen für die Veto-Prüfung: Vor der Qualitätssicherung des Prüfberichts übermittelt der Auditor (bei einem Auditteam: der Lead Auditor) folgende Unterlagen per E-Mail an den CADIS®-Fachbereich (CADIS@dekra.com): a) den ausgefüllten CADIS®-Prüfkatalog, b) die JSON-Datei aus dem CADIS®-Audittool, c) das Kick-Off-Material, d) die Bestätigungsmail (gemäß den CADIS®-Mailvorlagen, Handbuch Kapitel 14.1).</w:t>
       </w:r>
     </w:p>
     <w:p>
@@ -7896,7 +7896,7 @@
       </w:pPr>
       <w:r>
         <w:rPr/>
-        <w:t>Der Auditor prüft den Maßnahmenplan auf Vollständigkeit, Eignung und Plausibilität. Bewertet wird insbesondere, ob jede Abweichung adressiert ist, ob die Maßnahmen geeignet sind, die Ursache wirksam abzustellen, und ob die Zeitplanung angemessen und mit den geltenden Fristen vereinbar ist. Ist der Maßnahmenplan nicht geeignet, fordert der Auditor eine einmalige Nachbesserung mit einer Frist von weiteren 2 Wochen. Kann der Maßnahmenplan auch danach nicht freigegeben werden, ist der CADIS®-Fachbereich einzubinden. Wird der Maßnahmenplan nicht fristgerecht eingereicht oder kann er auch nach Einbindung des CADIS®-Fachbereichs nicht freigegeben werden, wird der Prüfbericht ohne Maßnahmenplan erstellt (Ausnahme von Kapitel 4.1.3 und 4.2.1). Eine Freigabe oder temporäre Freigabe wird nicht erteilt; eine bestehende Freigabe erlischt.</w:t>
+        <w:t>Der Auditor prüft den Maßnahmenplan auf Vollständigkeit, Eignung und Plausibilität. Bewertet wird insbesondere, ob jede Abweichung adressiert ist, ob die Maßnahmen geeignet sind, die Ursache wirksam abzustellen, und ob die Zeitplanung angemessen und mit den geltenden Fristen vereinbar ist. Ist der Maßnahmenplan nicht geeignet, fordert der Auditor eine einmalige Nachbesserung mit einer Frist von weiteren 2 Wochen. Kann der Maßnahmenplan auch danach nicht freigegeben werden, ist der CADIS®-Fachbereich einzubinden. Wird der Maßnahmenplan nicht fristgerecht eingereicht oder kann er auch nach Einbindung des CADIS®-Fachbereichs nicht freigegeben werden, wird der Prüfbericht ohne Maßnahmenplan erstellt (Ausnahme von Kapitel 4.1.3 und 4.2.1). Eine Freigabe oder temporäre Freigabe wird nicht erteilt.</w:t>
       </w:r>
     </w:p>
     <w:p>
@@ -8812,7 +8812,7 @@
       </w:pPr>
       <w:r>
         <w:rPr/>
-        <w:t>Die Erweiterungsprüfung dient der nachträglichen Erweiterung des Prüfscopes nach Abschluss einer Erstprüfung. Mögliche Scope-Erweiterungen sind zusätzliche Standorte, weitere Prüfmodule, die Anhebung des Level of Examination oder der Einbezug geänderter Sonderanforderungen. Voraussetzungen:</w:t>
+        <w:t>Die Erweiterungsprüfung dient der nachträglichen Erweiterung des Prüfscopes nach Abschluss einer Erstprüfung. Mögliche Scope-Erweiterungen sind zusätzliche Standorte, weitere Prüfmodule, die Anpassung des Level of Examination oder der Einbezug geänderter Sonderanforderungen. Voraussetzungen:</w:t>
       </w:r>
     </w:p>
     <w:p>
@@ -10034,7 +10034,7 @@
       </w:pPr>
       <w:r>
         <w:rPr/>
-        <w:t>Die Kriterien werden in der Reihenfolge „kritisch abweichend“, „nicht kritisch abweichend“, „konform“ geprüft; das zuerst zutreffende Kriterium bestimmt das Prüfergebnis. Reifegrad und Feststellung werden unabhängig voneinander vergeben; ein Prüfpunkt mit Reifegrad 0 kann jedoch nicht konform sein. Beobachtungen haben keinen Einfluss auf das Prüfergebnis. Unterschreitet der Security Score einen Schwellenwert, ohne dass entsprechende Abweichungen vorliegen, prüft der Auditor die Reifegrade und Feststellungen erneut auf Konsistenz (CADIS®-Handbuch, Kapitel 4.10). Verbleibt es nach der Konsistenzprüfung bei einer Unterschreitung des Schwellenwerts ohne Feststellung, sind die Prüfpunkte, die den Security Score maßgeblich bestimmen, als Abweichungen zu erfassen; der Maßnahmenplan bezieht sich auf diese Abweichungen.</w:t>
+        <w:t>Die Kriterien werden in der Reihenfolge „kritisch abweichend“, „nicht kritisch abweichend“, „konform“ geprüft; das zuerst zutreffende Kriterium bestimmt das Prüfergebnis. Reifegrad und Feststellung werden unabhängig voneinander vergeben; ein Prüfpunkt mit Reifegrad 0 kann jedoch nicht konform sein. Beobachtungen haben keinen Einfluss auf das Prüfergebnis. Unterschreitet der Security Score einen Schwellenwert, ohne dass entsprechende Abweichungen vorliegen, prüft der Auditor die Reifegrade und Feststellungen erneut auf Konsistenz und dokumentiert das Ergebnis dieser Prüfung (CADIS®-Handbuch, Kapitel 4.10).</w:t>
       </w:r>
     </w:p>
     <w:p>

</xml_diff>

<commit_message>
Erweiterungsprüfung an aktualisiertes CADIS-Handbuch angepasst; Geheimschutz in 1.2 präzisiert
Co-Authored-By: Claude Sonnet 5.5 <noreply@anthropic.com>
Claude-Session: https://claude.ai/code/session_01WyvNodyyJRof1fHMN8ju4o
</commit_message>
<xml_diff>
--- a/CADIS_Prozessbeschreibung_bereinigt.docx
+++ b/CADIS_Prozessbeschreibung_bereinigt.docx
@@ -13,7 +13,7 @@
         <mc:AlternateContent>
           <mc:Choice Requires="wps">
             <w:drawing>
-              <wp:anchor behindDoc="1" distT="0" distB="0" distL="0" distR="0" simplePos="0" locked="0" layoutInCell="0" allowOverlap="1" relativeHeight="61" wp14:anchorId="2A1C405D">
+              <wp:anchor behindDoc="1" distT="0" distB="0" distL="0" distR="0" simplePos="0" locked="0" layoutInCell="0" allowOverlap="1" relativeHeight="63" wp14:anchorId="2A1C405D">
                 <wp:simplePos x="0" y="0"/>
                 <wp:positionH relativeFrom="page">
                   <wp:posOffset>5334000</wp:posOffset>
@@ -88,7 +88,7 @@
         <mc:AlternateContent>
           <mc:Choice Requires="wps">
             <w:drawing>
-              <wp:anchor behindDoc="1" distT="0" distB="0" distL="0" distR="0" simplePos="0" locked="0" layoutInCell="0" allowOverlap="1" relativeHeight="62" wp14:anchorId="14500869">
+              <wp:anchor behindDoc="1" distT="0" distB="0" distL="0" distR="0" simplePos="0" locked="0" layoutInCell="0" allowOverlap="1" relativeHeight="64" wp14:anchorId="14500869">
                 <wp:simplePos x="0" y="0"/>
                 <wp:positionH relativeFrom="page">
                   <wp:posOffset>6223000</wp:posOffset>
@@ -147,7 +147,7 @@
         <mc:AlternateContent>
           <mc:Choice Requires="wps">
             <w:drawing>
-              <wp:anchor behindDoc="1" distT="0" distB="0" distL="0" distR="0" simplePos="0" locked="0" layoutInCell="0" allowOverlap="1" relativeHeight="63" wp14:anchorId="2EB9B489">
+              <wp:anchor behindDoc="1" distT="0" distB="0" distL="0" distR="0" simplePos="0" locked="0" layoutInCell="0" allowOverlap="1" relativeHeight="65" wp14:anchorId="2EB9B489">
                 <wp:simplePos x="0" y="0"/>
                 <wp:positionH relativeFrom="page">
                   <wp:posOffset>7112000</wp:posOffset>
@@ -4019,7 +4019,7 @@
       </w:pPr>
       <w:r>
         <w:rPr/>
-        <w:t>das Prüfmodul Geheimschutz, das ausschließlich durch den Hersteller/Auftraggeber geprüft wird und nicht in Security Score, Prüfergebnis und Freigabe einfließt (siehe CADIS®-Handbuch, Kapitel 4.3.1),</w:t>
+        <w:t>das Prüfmodul Geheimschutz, das nicht durch die DEKRA, sondern ausschließlich durch den Hersteller/Auftraggeber geprüft wird und nicht in Security Score, Prüfergebnis und Freigabe einfließt (siehe CADIS®-Handbuch, Kapitel 4.3.1),</w:t>
       </w:r>
     </w:p>
     <w:p>
@@ -8629,7 +8629,7 @@
       </w:pPr>
       <w:r>
         <w:rPr/>
-        <w:t>Die Überwachungsprüfung wird in der Methodik des für den Prüfscope festgelegten Level of Examination durchgeführt. Der Ablauf entspricht den Schritten 06 bis 08 der Erstprüfung, bezogen auf die risikobasiert ausgewählten Prüffragen zuzüglich der offenen Abweichungen aus der vorangegangenen Prüfung; Standorte, Prüfmodule und LoE werden gegenüber der Erstprüfung nicht reduziert.</w:t>
+        <w:t>Die Überwachungsprüfung wird in der Methodik des für den Prüfscope festgelegten Level of Examination durchgeführt. Der Ablauf entspricht den Schritten 06 bis 08 der Erstprüfung, bezogen auf die risikobasiert ausgewählten Prüffragen zuzüglich der offenen Abweichungen aus der vorangegangenen Prüfung; Standorte, Prüfmodule und LoE werden gegenüber der Erstprüfung nicht reduziert. Die Überwachungsprüfung kann mit einer Erweiterungsprüfung kombiniert werden (Kapitel 5.1.3).</w:t>
       </w:r>
     </w:p>
     <w:p>
@@ -8812,7 +8812,7 @@
       </w:pPr>
       <w:r>
         <w:rPr/>
-        <w:t>Die Erweiterungsprüfung dient der nachträglichen Erweiterung des Prüfscopes nach Abschluss einer Erstprüfung. Mögliche Scope-Erweiterungen sind zusätzliche Standorte, weitere Prüfmodule, die Anpassung des Level of Examination oder der Einbezug geänderter Sonderanforderungen. Voraussetzungen:</w:t>
+        <w:t>Die Erweiterungsprüfung dient der nachträglichen Erweiterung des Prüfscopes nach Abschluss einer Erstprüfung. Mögliche Scope-Erweiterungen sind zusätzliche Standorte, weitere Prüfmodule oder die Anhebung des Level of Examination; mit der Anhebung ändert sich auch die Stufe der Sonderanforderungen. Die Erweiterung kann vom Hersteller/Auftraggeber oder vom geprüften Unternehmen angestoßen werden. Voraussetzungen:</w:t>
       </w:r>
     </w:p>
     <w:p>
@@ -8840,7 +8840,7 @@
       </w:pPr>
       <w:r>
         <w:rPr/>
-        <w:t>Zum Zeitpunkt der Scope-Änderung sind keine kritischen Abweichungen aus der Erstprüfung offen.</w:t>
+        <w:t>Zum Zeitpunkt der Scope-Änderung sind keine kritischen Abweichungen aus der Erstprüfung offen; diese sind zuvor abzustellen oder begründet auf nicht kritisch herabzustufen. Offene nicht kritische Abweichungen (z. B. bei temporärer Freigabe) stehen der Erweiterung nicht entgegen.</w:t>
       </w:r>
     </w:p>
     <w:p>
@@ -8854,7 +8854,7 @@
       </w:pPr>
       <w:r>
         <w:rPr/>
-        <w:t>Die Erweiterung wurde beauftragt; alle Scope-Änderungen werden dokumentiert.</w:t>
+        <w:t>Die Erweiterung wurde beauftragt; alle Scope-Änderungen werden dokumentiert. Der erweiterte Scope ist vor Beginn der Erweiterungsprüfung schriftlich bestätigt.</w:t>
       </w:r>
     </w:p>
     <w:p>
@@ -8887,7 +8887,7 @@
           <w:b/>
           <w:bCs/>
         </w:rPr>
-        <w:t>Schritt E-01: Antrag und Abstimmung der Scope-Änderung</w:t>
+        <w:t>Schritt E-01: Anstoß und Abstimmung der Scope-Änderung</w:t>
       </w:r>
     </w:p>
     <w:p>
@@ -8897,7 +8897,7 @@
       </w:pPr>
       <w:r>
         <w:rPr/>
-        <w:t>Das geprüfte Unternehmen beantragt die Erweiterung und beschreibt die vorgesehene Änderung des Prüfscopes. Der CADIS®-Fachbereich prüft die Voraussetzungen, insbesondere den Status offener Abweichungen. Änderungen des Prüfscopes bedürfen der Zustimmung der beteiligten Parteien einschließlich des Herstellers/Auftraggebers, soweit die Änderung Ausschlüsse betrifft.</w:t>
+        <w:t>Das geprüfte Unternehmen oder der Hersteller/Auftraggeber stößt die Erweiterung an und beschreibt die vorgesehene Änderung des Prüfscopes. Der CADIS®-Fachbereich prüft die Voraussetzungen, insbesondere den Status offener Abweichungen. Änderungen des Prüfscopes bedürfen der Zustimmung der beteiligten Parteien einschließlich des Herstellers/Auftraggebers, soweit die Änderung Ausschlüsse betrifft. Der Hersteller/Auftraggeber erstellt vor der Beauftragung einen aktualisierten Scope-Entwurf mit Ausgangsscope und beabsichtigter Änderung; bei Änderung des Level of Examination aktualisiert er die SCE. Der erweiterte Scope wird vor Beginn der Prüfung schriftlich bestätigt.</w:t>
       </w:r>
     </w:p>
     <w:p>
@@ -8933,7 +8933,7 @@
       </w:pPr>
       <w:r>
         <w:rPr/>
-        <w:t>Der Auditor legt fest, welche Prüfmodule, Prüffragen und Standorte durch die Erweiterung zusätzlich zu prüfen sind. Ergebnisse der Erstprüfung, die von der Erweiterung nicht berührt sind, sollen wiederverwendet werden. Haben sich die von der Erweiterung betroffenen Prozesse seit der Erstprüfung geändert, sind diese erneut zu bewerten. Wird im Rahmen der Erweiterung das Level of Examination angehoben, gilt die Anhebung rückwirkend für den gesamten bestehenden Prüfscope; die bereits geprüften Prüfmodule sind in der Prüftiefe des neuen Level of Examination erneut zu bewerten. Eine gemischte Darstellung unterschiedlicher Prüftiefen innerhalb eines Prüfscopes ist nicht möglich; ausgenommen ist die standortbezogene Abstufung der Prüftiefe bei der Multi-Site-Prüfung nach CADIS®-Handbuch, Kapitel 11.</w:t>
+        <w:t>Der Auditor legt fest, welche Prüfmodule, Prüffragen und Standorte durch die Erweiterung zusätzlich zu prüfen sind. Ergebnisse der Erstprüfung, die von der Erweiterung nicht berührt sind, sollen wiederverwendet werden. Haben sich die von der Erweiterung betroffenen Prozesse seit der Erstprüfung geändert, sind diese erneut zu bewerten. Wird im Rahmen der Erweiterung das Level of Examination angehoben, gilt die Anhebung rückwirkend für den gesamten bestehenden Prüfscope; der Prüfumfang in bereits geprüften Prüfmodulen richtet sich nach den nachfolgend genannten Regeln zur Reduzierung des Prüfumfangs. Eine gemischte Darstellung unterschiedlicher Prüftiefen innerhalb eines Prüfscopes ist nicht möglich; ausgenommen ist die standortbezogene Abstufung der Prüftiefe bei der Multi-Site-Prüfung nach CADIS®-Handbuch, Kapitel 11. Der Prüfumfang darf je Prüfpunkt risikobasiert reduziert werden, wenn der Auditor nachvollziehbar begründet, dass der Prüfpunkt von der Erweiterung nicht berührt wird oder übergreifend gesteuert wird und bereits in der Erstprüfung in gleicher oder höherer Prüftiefe bewertet wurde, sich die Umsetzung seit der Erstprüfung nicht wesentlich geändert hat und keine gegenteiligen Anhaltspunkte vorliegen (z. B. offene Abweichungen oder Beobachtungen, Sicherheitsvorfälle, Hinweise aus der Überwachung). Die Reduzierung ist je Prüfpunkt zu begründen und in der Prüfdokumentation festzuhalten; eine Freigabe durch den CADIS®-Fachbereich ist nicht erforderlich. Nicht reduziert werden dürfen die Prüfpunkte zusätzlicher Prüfmodule sowie die standortspezifischen Prüfpunkte eines neuen Standorts. Der Auditor dokumentiert, welche Ergebnisse der Erstprüfung wiederverwendet werden. Welche Prüfgegenstände je Art der Scope-Erweiterung zu prüfen sind, regelt die Übersicht im CADIS®-Handbuch, Kapitel 6.12.</w:t>
       </w:r>
     </w:p>
     <w:p>
@@ -8969,7 +8969,7 @@
       </w:pPr>
       <w:r>
         <w:rPr/>
-        <w:t>Die Durchführung folgt den Schritten 06 bis 10 der Erstprüfung, bezogen auf den Erweiterungsumfang. Werden dabei Feststellungen in bereits geprüften Bereichen erkannt, sind diese als Feststellungen der Erweiterungsprüfung zu dokumentieren und zu behandeln.</w:t>
+        <w:t>Die Durchführung folgt den Schritten 06 bis 10 der Erstprüfung, bezogen auf den Erweiterungsumfang. Ein Kick-Off (Schritt 04) wird bei Bedarf durchgeführt; ein Closing Meeting (Schritt 10) findet stets statt. Maßnahmenplan, Follow-Up, Fristen und Einreichungsversuche gelten wie bei der Erstprüfung. Der Security Score wird als Gesamtscore über den gesamten erweiterten Prüfscope berechnet; Reifegrade von Prüfpunkten, die nicht erneut bewertet werden, bleiben aus der Erstprüfung bestehen. Die Erweiterungsprüfung wird nach der Katalogversion der Erstprüfung beziehungsweise der ersten Beauftragung des laufenden Prüfzyklus durchgeführt (CADIS®-Handbuch, Kapitel 13). Werden dabei Feststellungen in bereits geprüften Bereichen erkannt, sind diese als Feststellungen der Erweiterungsprüfung zu dokumentieren und zu behandeln.</w:t>
       </w:r>
     </w:p>
     <w:p>
@@ -9048,7 +9048,7 @@
       </w:pPr>
       <w:r>
         <w:rPr/>
-        <w:t>Ergebnis ist der Bericht zur Erweiterungsprüfung sowie der aktualisierte Prüfscope. Die Erweiterungsprüfung begründet keine eigene Laufzeit: Der Bericht erbt die Laufzeit der ursprünglichen Freigabe; der laufende Prüfzyklus wird durch die Erweiterung weder verlängert noch neu begonnen. Werden Abweichungen festgestellt, gelten die Kapitel 4.2 und 4.3 entsprechend.</w:t>
+        <w:t>Ergebnis ist der Bericht zur Erweiterungsprüfung sowie der aktualisierte Prüfscope. Die Erweiterungsprüfung begründet keine eigene Laufzeit: Der Bericht erbt die Laufzeit der ursprünglichen Freigabe; der laufende Prüfzyklus wird durch die Erweiterung weder verlängert noch neu begonnen. Werden Abweichungen festgestellt, gelten die Kapitel 4.2 und 4.3 entsprechend. Bis zum Abschluss der Erweiterungsprüfung gilt die bestehende Freigabe unverändert. Die erweiterte Freigabe wird erst nach positivem Abschluss erteilt und bezieht sich auf den gesamten erweiterten Prüfscope. Wird die Erweiterungsprüfung abgebrochen oder keine erweiterte Freigabe erteilt, bleibt die bestehende Freigabe für den ursprünglichen Prüfscope bestehen. Die Erweiterungsprüfung kann mit der risikobasierten Überwachungsprüfung kombiniert werden; die Anforderungen beider Prüfarten sind einzuhalten und im Prüfbericht jeweils kenntlich zu machen.</w:t>
       </w:r>
     </w:p>
     <w:p>
@@ -10217,7 +10217,7 @@
                 <w:szCs w:val="19"/>
                 <w:lang w:val="de-DE" w:eastAsia="en-US" w:bidi="ar-SA"/>
               </w:rPr>
-              <w:t>Bestätigt die Konformität im festgelegten Prüfscope. Voraussetzung: Ergebnis „konform“. Laufzeit bis zu 2 Jahre bei ordnungsgemäßer Überwachungsprüfung. Ohne Überwachungsprüfung erlischt die Freigabe 12 Monate und 6 Wochen nach dem Closing Meeting der Erstprüfung (Ablauf des Toleranzfensters). Eine Erweiterungsprüfung erweitert den Prüfscope innerhalb dieser Laufzeit, ohne eine neue Laufzeit zu begründen.</w:t>
+              <w:t>Bestätigt die Konformität im festgelegten Prüfscope. Voraussetzung: Ergebnis „konform“. Laufzeit bis zu 2 Jahre bei ordnungsgemäßer Überwachungsprüfung. Ohne Überwachungsprüfung erlischt die Freigabe 12 Monate und 6 Wochen nach dem Closing Meeting der Erstprüfung (Ablauf des Toleranzfensters). Eine Erweiterungsprüfung erweitert den Prüfscope innerhalb dieser Laufzeit, ohne eine neue Laufzeit zu begründen. Bis zum Abschluss einer Erweiterungsprüfung gilt die bestehende Freigabe unverändert.</w:t>
             </w:r>
           </w:p>
         </w:tc>
@@ -10550,7 +10550,7 @@
                   <w:rFonts w:eastAsia="Noto Sans" w:cs=""/>
                   <w:lang w:val="de-DE" w:eastAsia="en-US" w:bidi="ar-SA"/>
                 </w:rPr>
-                <w:t>28</w:t>
+                <w:t>29</w:t>
               </w:r>
               <w:r>
                 <w:rPr>
@@ -10598,7 +10598,7 @@
                   <w:rFonts w:eastAsia="Noto Sans" w:cs=""/>
                   <w:lang w:val="de-DE" w:eastAsia="en-US" w:bidi="ar-SA"/>
                 </w:rPr>
-                <w:t>28</w:t>
+                <w:t>29</w:t>
               </w:r>
               <w:r>
                 <w:rPr>
@@ -10692,7 +10692,7 @@
     <w:r>
       <w:rPr/>
       <w:drawing>
-        <wp:anchor behindDoc="1" distT="0" distB="0" distL="0" distR="0" simplePos="0" locked="0" layoutInCell="0" allowOverlap="1" relativeHeight="32">
+        <wp:anchor behindDoc="1" distT="0" distB="0" distL="0" distR="0" simplePos="0" locked="0" layoutInCell="0" allowOverlap="1" relativeHeight="33">
           <wp:simplePos x="0" y="0"/>
           <wp:positionH relativeFrom="page">
             <wp:posOffset>-342265</wp:posOffset>
@@ -10737,7 +10737,7 @@
         </wp:anchor>
       </w:drawing>
       <w:drawing>
-        <wp:anchor behindDoc="1" distT="0" distB="0" distL="0" distR="0" simplePos="0" locked="0" layoutInCell="0" allowOverlap="1" relativeHeight="60">
+        <wp:anchor behindDoc="1" distT="0" distB="0" distL="0" distR="0" simplePos="0" locked="0" layoutInCell="0" allowOverlap="1" relativeHeight="62">
           <wp:simplePos x="0" y="0"/>
           <wp:positionH relativeFrom="page">
             <wp:posOffset>5581015</wp:posOffset>

</xml_diff>

<commit_message>
LoE 2 Phase 2: Auswahl der Interview-Prüfpunkte und Mitteilung an das Unternehmen
Co-Authored-By: Claude Sonnet 5.5 <noreply@anthropic.com>
Claude-Session: https://claude.ai/code/session_01WyvNodyyJRof1fHMN8ju4o
</commit_message>
<xml_diff>
--- a/CADIS_Prozessbeschreibung_bereinigt.docx
+++ b/CADIS_Prozessbeschreibung_bereinigt.docx
@@ -13,7 +13,7 @@
         <mc:AlternateContent>
           <mc:Choice Requires="wps">
             <w:drawing>
-              <wp:anchor behindDoc="1" distT="0" distB="0" distL="0" distR="0" simplePos="0" locked="0" layoutInCell="0" allowOverlap="1" relativeHeight="63" wp14:anchorId="2A1C405D">
+              <wp:anchor behindDoc="1" distT="0" distB="0" distL="0" distR="0" simplePos="0" locked="0" layoutInCell="0" allowOverlap="1" relativeHeight="65" wp14:anchorId="2A1C405D">
                 <wp:simplePos x="0" y="0"/>
                 <wp:positionH relativeFrom="page">
                   <wp:posOffset>5334000</wp:posOffset>
@@ -88,7 +88,7 @@
         <mc:AlternateContent>
           <mc:Choice Requires="wps">
             <w:drawing>
-              <wp:anchor behindDoc="1" distT="0" distB="0" distL="0" distR="0" simplePos="0" locked="0" layoutInCell="0" allowOverlap="1" relativeHeight="64" wp14:anchorId="14500869">
+              <wp:anchor behindDoc="1" distT="0" distB="0" distL="0" distR="0" simplePos="0" locked="0" layoutInCell="0" allowOverlap="1" relativeHeight="66" wp14:anchorId="14500869">
                 <wp:simplePos x="0" y="0"/>
                 <wp:positionH relativeFrom="page">
                   <wp:posOffset>6223000</wp:posOffset>
@@ -147,7 +147,7 @@
         <mc:AlternateContent>
           <mc:Choice Requires="wps">
             <w:drawing>
-              <wp:anchor behindDoc="1" distT="0" distB="0" distL="0" distR="0" simplePos="0" locked="0" layoutInCell="0" allowOverlap="1" relativeHeight="65" wp14:anchorId="2EB9B489">
+              <wp:anchor behindDoc="1" distT="0" distB="0" distL="0" distR="0" simplePos="0" locked="0" layoutInCell="0" allowOverlap="1" relativeHeight="67" wp14:anchorId="2EB9B489">
                 <wp:simplePos x="0" y="0"/>
                 <wp:positionH relativeFrom="page">
                   <wp:posOffset>7112000</wp:posOffset>
@@ -7312,6 +7312,23 @@
       <w:r>
         <w:rPr/>
         <w:t>Bei Prüfscopes mit mehreren Standorten sind zusätzlich die Regelungen zur Multi-Site-Prüfung (CADIS®-Handbuch, Kapitel 11) anzuwenden, insbesondere zur Stichprobenberechnung und zur standortbezogenen Prüfpunktauswahl.</w:t>
+      </w:r>
+    </w:p>
+    <w:p>
+      <w:pPr>
+        <w:pStyle w:val="Blocktext1"/>
+        <w:rPr/>
+      </w:pPr>
+      <w:r>
+        <w:rPr>
+          <w:b/>
+          <w:bCs/>
+        </w:rPr>
+        <w:t xml:space="preserve">Auswahl der Prüfpunkte im Remote-Interview (LoE 2): </w:t>
+      </w:r>
+      <w:r>
+        <w:rPr/>
+        <w:t>Welche Prüffragen im Interview besprochen werden, steht erst nach Abschluss der Phase 1 fest. Der Auditor wählt sie auf Grundlage der Ergebnisse der Phase 1 risikobasiert aus und teilt dem geprüften Unternehmen die ausgewählten Prüffragen rechtzeitig vor Beginn der Phase 2 mit; in der Überwachungsprüfung erfolgt die Auswahl innerhalb der nach Schritt Ü-03 mitgeteilten Prüffragen. Die Auswahl bildet eine ausgewogene Mischung aus den Prüffragen des gesamten Prüfscopes: Jedes Prüfmodul des Scopes wird durch mindestens einen Prüfpunkt abgedeckt. Die Gewichtung innerhalb und zwischen den Modulen richtet sich nach Risiko und Aussagekraft, insbesondere nach Auffälligkeiten oder Widersprüchen aus Phase 1, niedrigen Reifegraden, dem Schutzbedarf und – in der Überwachungsprüfung – offenen Abweichungen und Beobachtungen. Bei Prüfscopes mit mehreren Standorten erfolgt die Auswahl je Standort (Kapitel 5.3). Der Umfang des Interviews richtet sich nach der Auditzeit, die sich aus dem Auditvertrag und der Auditzeitberechnung (CADIS® Auditplan Generator) ergibt. Die vereinbarte Auditzeit ist einzuhalten und darf nicht wesentlich unterschritten werden; eine Unterschreitung ist nachvollziehbar zu begründen und zu dokumentieren. Die Auswahl der Prüfpunkte und ihre Begründung sind Bestandteil der Prüfdokumentation. Bei einem Auditteam legt der Lead Auditor die Verteilung der Interviewzeit auf die Prüfmodule fest (Kapitel 2.3).</w:t>
       </w:r>
     </w:p>
     <w:p>
@@ -10550,7 +10567,7 @@
                   <w:rFonts w:eastAsia="Noto Sans" w:cs=""/>
                   <w:lang w:val="de-DE" w:eastAsia="en-US" w:bidi="ar-SA"/>
                 </w:rPr>
-                <w:t>29</w:t>
+                <w:t>30</w:t>
               </w:r>
               <w:r>
                 <w:rPr>
@@ -10598,7 +10615,7 @@
                   <w:rFonts w:eastAsia="Noto Sans" w:cs=""/>
                   <w:lang w:val="de-DE" w:eastAsia="en-US" w:bidi="ar-SA"/>
                 </w:rPr>
-                <w:t>29</w:t>
+                <w:t>30</w:t>
               </w:r>
               <w:r>
                 <w:rPr>
@@ -10692,7 +10709,7 @@
     <w:r>
       <w:rPr/>
       <w:drawing>
-        <wp:anchor behindDoc="1" distT="0" distB="0" distL="0" distR="0" simplePos="0" locked="0" layoutInCell="0" allowOverlap="1" relativeHeight="33">
+        <wp:anchor behindDoc="1" distT="0" distB="0" distL="0" distR="0" simplePos="0" locked="0" layoutInCell="0" allowOverlap="1" relativeHeight="34">
           <wp:simplePos x="0" y="0"/>
           <wp:positionH relativeFrom="page">
             <wp:posOffset>-342265</wp:posOffset>
@@ -10737,7 +10754,7 @@
         </wp:anchor>
       </w:drawing>
       <w:drawing>
-        <wp:anchor behindDoc="1" distT="0" distB="0" distL="0" distR="0" simplePos="0" locked="0" layoutInCell="0" allowOverlap="1" relativeHeight="62">
+        <wp:anchor behindDoc="1" distT="0" distB="0" distL="0" distR="0" simplePos="0" locked="0" layoutInCell="0" allowOverlap="1" relativeHeight="64">
           <wp:simplePos x="0" y="0"/>
           <wp:positionH relativeFrom="page">
             <wp:posOffset>5581015</wp:posOffset>

</xml_diff>

<commit_message>
Veto-Prüfung als QS definiert, Einreichung über TeamBeam; Überwachungsprüfung mit Abstimmung und Closing Meeting
Co-Authored-By: Claude Sonnet 5.5 <noreply@anthropic.com>
Claude-Session: https://claude.ai/code/session_01WyvNodyyJRof1fHMN8ju4o
</commit_message>
<xml_diff>
--- a/CADIS_Prozessbeschreibung_bereinigt.docx
+++ b/CADIS_Prozessbeschreibung_bereinigt.docx
@@ -5403,7 +5403,7 @@
       </w:r>
       <w:r>
         <w:rPr/>
-        <w:t>Die Maßnahmenplanbewertung erfolgt durch den Lead Auditor mit Zuarbeit der modulverantwortlichen Auditoren. Die Unterlagen für die Veto-Prüfung beziehungsweise bei Auditabbruch übermittelt der Lead Auditor (Schritt 11, Schritt 07).</w:t>
+        <w:t>Die Maßnahmenplanbewertung erfolgt durch den Lead Auditor mit Zuarbeit der modulverantwortlichen Auditoren. Die Unterlagen für die Veto-Prüfung beziehungsweise bei Auditabbruch reicht der Lead Auditor (Schritt 11, Schritt 07).</w:t>
       </w:r>
     </w:p>
     <w:p>
@@ -7212,7 +7212,7 @@
       </w:pPr>
       <w:r>
         <w:rPr/>
-        <w:t>Auf Grundlage der Erkenntnisse entscheidet der Auditor, ob die Prüfung im geplanten Umfang fortgeführt, verschoben oder in Ausnahmefällen abgebrochen wird. Bei negativem Ergebnis wird das Unternehmen zur Nachbesserung aufgefordert. Insgesamt stehen maximal drei Einreichungsversuche zur Verfügung; als Einreichungsversuch gilt jede formale Übermittlung des Prüfkatalogs an den Auditor. Nach dem dritten erfolglosen Versuch ist die Prüfung abzubrechen. Weitere Abbruchgründe, die Folgen eines Abbruchs sowie die Regeln zur Verschiebung sind im CADIS®-Handbuch, Kapitel 6.13, festgelegt. Bei jedem Auditabbruch übermittelt der Auditor (bei einem Auditteam: der Lead Auditor) die bis dahin vorliegenden Unterlagen (ausgefüllter CADIS®-Prüfkatalog, JSON-Datei aus dem CADIS®-Audittool, Kick-Off-Material, Bestätigungsmail gemäß den CADIS®-Mailvorlagen, Handbuch Kapitel 14.1) per E-Mail an den CADIS®-Fachbereich (CADIS@dekra.com); dieser entscheidet über das weitere Vorgehen.</w:t>
+        <w:t>Auf Grundlage der Erkenntnisse entscheidet der Auditor, ob die Prüfung im geplanten Umfang fortgeführt, verschoben oder in Ausnahmefällen abgebrochen wird. Bei negativem Ergebnis wird das Unternehmen zur Nachbesserung aufgefordert. Insgesamt stehen maximal drei Einreichungsversuche zur Verfügung; als Einreichungsversuch gilt jede formale Übermittlung des Prüfkatalogs an den Auditor. Nach dem dritten erfolglosen Versuch ist die Prüfung abzubrechen. Weitere Abbruchgründe, die Folgen eines Abbruchs sowie die Regeln zur Verschiebung sind im CADIS®-Handbuch, Kapitel 6.13, festgelegt. Bei jedem Auditabbruch reicht der Auditor (bei einem Auditteam: der Lead Auditor) die bis dahin vorliegenden Unterlagen (ausgefüllter CADIS®-Prüfkatalog, JSON-Datei aus dem CADIS®-Audittool, Kick-Off-Material, Bestätigungsmail gemäß den CADIS®-Mailvorlagen, Handbuch Kapitel 14.1) über seinen TeamBeam-Account beim CADIS®-Fachbereich (CADIS@dekra.com) ein; dieser entscheidet über das weitere Vorgehen.</w:t>
       </w:r>
     </w:p>
     <w:p>
@@ -7462,7 +7462,7 @@
       </w:pPr>
       <w:r>
         <w:rPr/>
-        <w:t>Unterlagen für die Veto-Prüfung: Vor der Qualitätssicherung des Prüfberichts übermittelt der Auditor (bei einem Auditteam: der Lead Auditor) folgende Unterlagen per E-Mail an den CADIS®-Fachbereich (CADIS@dekra.com): a) den ausgefüllten CADIS®-Prüfkatalog, b) die JSON-Datei aus dem CADIS®-Audittool, c) das Kick-Off-Material, d) die Bestätigungsmail (gemäß den CADIS®-Mailvorlagen, Handbuch Kapitel 14.1).</w:t>
+        <w:t>Veto-Prüfung: Die Qualitätssicherung des Prüfberichts durch den CADIS®-Fachbereich erfolgt als Veto-Prüfung. Hierzu reicht der Auditor (bei einem Auditteam: der Lead Auditor) vor der Qualitätssicherung folgende Unterlagen über seinen TeamBeam-Account beim CADIS®-Fachbereich (CADIS@dekra.com) ein: a) den ausgefüllten CADIS®-Prüfkatalog, b) die JSON-Datei aus dem CADIS®-Audittool, c) das Kick-Off-Material, d) die Bestätigungsmail (gemäß den CADIS®-Mailvorlagen, Handbuch Kapitel 14.1).</w:t>
       </w:r>
     </w:p>
     <w:p>
@@ -7949,7 +7949,7 @@
       </w:pPr>
       <w:r>
         <w:rPr/>
-        <w:t>Der Auditor gibt den Maßnahmenplan frei: Nicht kritische Abweichungen aus einer Erst- oder Erweiterungsprüfung sind spätestens bis zur risikobasierten Überwachungsprüfung im Folgejahr zu schließen; für in der Überwachungsprüfung neu festgestellte nicht kritische Abweichungen gilt die Frist von 3 Monaten ab dem Closing Meeting beziehungsweise, sofern keines stattfindet, ab der Mitteilung der Feststellungen (Kapitel 3.2). Kritische Abweichungen sind innerhalb von 3 Monaten ab dem Closing Meeting zu schließen oder wirksam so zu korrigieren, dass eine Herabstufung begründet werden kann. Eine herabgestufte Abweichung aus einer Erst- oder Erweiterungsprüfung gilt als nicht kritische Abweichung und ist spätestens bis zur risikobasierten Überwachungsprüfung zu schließen.</w:t>
+        <w:t>Der Auditor gibt den Maßnahmenplan frei: Nicht kritische Abweichungen aus einer Erst- oder Erweiterungsprüfung sind spätestens bis zur risikobasierten Überwachungsprüfung im Folgejahr zu schließen; für in der Überwachungsprüfung neu festgestellte nicht kritische Abweichungen gilt die Frist von 3 Monaten ab dem Closing Meeting der Überwachungsprüfung. Kritische Abweichungen sind innerhalb von 3 Monaten ab dem Closing Meeting zu schließen oder wirksam so zu korrigieren, dass eine Herabstufung begründet werden kann. Eine herabgestufte Abweichung aus einer Erst- oder Erweiterungsprüfung gilt als nicht kritische Abweichung und ist spätestens bis zur risikobasierten Überwachungsprüfung zu schließen.</w:t>
       </w:r>
     </w:p>
     <w:p>
@@ -8646,7 +8646,7 @@
       </w:pPr>
       <w:r>
         <w:rPr/>
-        <w:t>Die Überwachungsprüfung wird in der Methodik des für den Prüfscope festgelegten Level of Examination durchgeführt. Der Ablauf entspricht den Schritten 06 bis 08 der Erstprüfung, bezogen auf die risikobasiert ausgewählten Prüffragen zuzüglich der offenen Abweichungen aus der vorangegangenen Prüfung; Standorte, Prüfmodule und LoE werden gegenüber der Erstprüfung nicht reduziert. Die Überwachungsprüfung kann mit einer Erweiterungsprüfung kombiniert werden (Kapitel 5.1.3).</w:t>
+        <w:t>Die Überwachungsprüfung wird in der Methodik des für den Prüfscope festgelegten Level of Examination durchgeführt. Der Ablauf entspricht den Schritten 06 bis 08 der Erstprüfung, bezogen auf die risikobasiert ausgewählten Prüffragen zuzüglich der offenen Abweichungen aus der vorangegangenen Prüfung; Standorte, Prüfmodule und LoE werden gegenüber der Erstprüfung nicht reduziert. Die Überwachungsprüfung kann mit einer Erweiterungsprüfung kombiniert werden (Kapitel 5.1.3). Ein Kick-Off ist nicht erforderlich; der Auditor stimmt jedoch Termin, Ansprechpartner und – bei LoE 2 und LoE 3 – die Prüfagenda vorab mit dem geprüften Unternehmen ab. Im Anschluss an die Bewertung (Schritt Ü-05) findet das Closing Meeting entsprechend Schritt 10 der Erstprüfung statt.</w:t>
       </w:r>
     </w:p>
     <w:p>
@@ -8688,7 +8688,7 @@
         <w:br/>
         <w:t>b) Wird eine nicht kritische Abweichung festgestellt, wird die bestehende Freigabe mit sofortiger Wirkung in eine temporäre Freigabe umgewandelt. Die Abstellung hat innerhalb von 3 Monaten zu erfolgen; andernfalls ist eine vollständige Neuprüfung durchzuführen.</w:t>
         <w:br/>
-        <w:t>c) Sind nicht kritische Abweichungen aus der vorangegangenen Prüfung nicht wirksam abgestellt, werden sie zu kritischen Abweichungen; die bestehende Freigabe erlischt mit unmittelbarer Wirkung, und es gilt Buchstabe a). Die Fristen nach a) bis c) beginnen mit dem Closing Meeting beziehungsweise, sofern keines stattfindet, mit dem Tag der Mitteilung der Feststellungen (Kapitel 3.2).</w:t>
+        <w:t>c) Sind nicht kritische Abweichungen aus der vorangegangenen Prüfung nicht wirksam abgestellt, werden sie zu kritischen Abweichungen; die bestehende Freigabe erlischt mit unmittelbarer Wirkung, und es gilt Buchstabe a). Die Fristen nach a) bis c) beginnen mit dem Closing Meeting.</w:t>
       </w:r>
     </w:p>
     <w:p>
@@ -8724,7 +8724,7 @@
       </w:pPr>
       <w:r>
         <w:rPr/>
-        <w:t>Der CADIS®-Fachbereich erstellt den Bericht zur Überwachungsprüfung auf Basis der Bewertung des Auditors, führt die Qualitätssicherung durch, meldet das Ergebnis in die CADIS®-Datenbank und aktualisiert den Freigabestatus. Wurden Abweichungen festgestellt, ist – wie bei der Erstprüfung – ein vorliegender und freigegebener Maßnahmenplan nach Kapitel 4.2 Voraussetzung für die Erstellung des Berichts; er entfällt nur, wenn das geprüfte Unternehmen ausdrücklich keine temporäre Freigabe anstrebt und keine kritische Abweichung festgestellt wurde. Die Unterlagen für die Veto-Prüfung sind entsprechend Schritt 11 zu übermitteln.</w:t>
+        <w:t>Der CADIS®-Fachbereich erstellt den Bericht zur Überwachungsprüfung auf Basis der Bewertung des Auditors, führt die Qualitätssicherung durch, meldet das Ergebnis in die CADIS®-Datenbank und aktualisiert den Freigabestatus. Wurden Abweichungen festgestellt, ist – wie bei der Erstprüfung – ein vorliegender und freigegebener Maßnahmenplan nach Kapitel 4.2 Voraussetzung für die Erstellung des Berichts; er entfällt nur, wenn das geprüfte Unternehmen ausdrücklich keine temporäre Freigabe anstrebt und keine kritische Abweichung festgestellt wurde. Die Unterlagen für die Veto-Prüfung sind entsprechend Schritt 11 einzureichen.</w:t>
       </w:r>
     </w:p>
     <w:p>
@@ -9022,7 +9022,7 @@
       </w:pPr>
       <w:r>
         <w:rPr/>
-        <w:t>Der CADIS®-Fachbereich erstellt den Bericht zur Erweiterungsprüfung auf Basis der Bewertung des Auditors und aktualisiert den Prüfscope und den Freigabestatus in der CADIS®-Datenbank. Wurden Abweichungen festgestellt, ist ein vorliegender und freigegebener Maßnahmenplan nach Kapitel 4.2 Voraussetzung für die Erstellung des Berichts. Die Unterlagen für die Veto-Prüfung sind entsprechend Schritt 11 zu übermitteln.</w:t>
+        <w:t>Der CADIS®-Fachbereich erstellt den Bericht zur Erweiterungsprüfung auf Basis der Bewertung des Auditors und aktualisiert den Prüfscope und den Freigabestatus in der CADIS®-Datenbank. Wurden Abweichungen festgestellt, ist ein vorliegender und freigegebener Maßnahmenplan nach Kapitel 4.2 Voraussetzung für die Erstellung des Berichts. Die Unterlagen für die Veto-Prüfung sind entsprechend Schritt 11 einzureichen.</w:t>
       </w:r>
     </w:p>
     <w:p>

</xml_diff>

<commit_message>
Veto-Prüfung: Inhalt und Korrekturen; Closing Meeting im Anschluss an Phase 2, ggf. verschiebbar
Co-Authored-By: Claude Sonnet 5.5 <noreply@anthropic.com>
Claude-Session: https://claude.ai/code/session_01WyvNodyyJRof1fHMN8ju4o
</commit_message>
<xml_diff>
--- a/CADIS_Prozessbeschreibung_bereinigt.docx
+++ b/CADIS_Prozessbeschreibung_bereinigt.docx
@@ -7400,7 +7400,7 @@
       </w:pPr>
       <w:r>
         <w:rPr/>
-        <w:t>Das Closing Meeting findet am letzten Tag der Prüfung statt und bildet den formalen Abschluss der Prüfung. Der Auditor stellt die wesentlichen Ergebnisse vor und erläutert die Prüfeinstufung sowie die relevanten Feststellungen. Im Closing Meeting werden abgestimmt:</w:t>
+        <w:t>Das Closing Meeting findet im unmittelbaren Anschluss an die Phase 2 statt und bildet den formalen Abschluss der Prüfung. Findet das Closing Meeting remote statt oder nimmt eine größere Runde teil, kann es bei Bedarf um wenige Tage nach hinten verschoben werden; die Verschiebung ist zu dokumentieren. Die Fristen beginnen mit dem tatsächlichen Tag des Closing Meetings. Der Auditor stellt die wesentlichen Ergebnisse vor und erläutert die Prüfeinstufung sowie die relevanten Feststellungen. Im Closing Meeting werden abgestimmt:</w:t>
         <w:br/>
         <w:t>a) die Anforderungen an einen gegebenenfalls erforderlichen Maßnahmenplan einschließlich Verantwortlichkeiten, Fristen und Nachweisführung,</w:t>
         <w:br/>
@@ -7462,7 +7462,7 @@
       </w:pPr>
       <w:r>
         <w:rPr/>
-        <w:t>Veto-Prüfung: Die Qualitätssicherung des Prüfberichts durch den CADIS®-Fachbereich erfolgt als Veto-Prüfung. Hierzu reicht der Auditor (bei einem Auditteam: der Lead Auditor) vor der Qualitätssicherung folgende Unterlagen über seinen TeamBeam-Account beim CADIS®-Fachbereich (CADIS@dekra.com) ein: a) den ausgefüllten CADIS®-Prüfkatalog, b) die JSON-Datei aus dem CADIS®-Audittool, c) das Kick-Off-Material, d) die Bestätigungsmail (gemäß den CADIS®-Mailvorlagen, Handbuch Kapitel 14.1).</w:t>
+        <w:t>Veto-Prüfung: Die Qualitätssicherung des Prüfberichts durch den CADIS®-Fachbereich erfolgt als Veto-Prüfung. Hierzu reicht der Auditor (bei einem Auditteam: der Lead Auditor) vor der Qualitätssicherung folgende Unterlagen über seinen TeamBeam-Account beim CADIS®-Fachbereich (CADIS@dekra.com) ein: a) den ausgefüllten CADIS®-Prüfkatalog, b) die JSON-Datei aus dem CADIS®-Audittool, c) das Kick-Off-Material, d) die Bestätigungsmail (gemäß den CADIS®-Mailvorlagen, Handbuch Kapitel 14.1). Der CADIS®-Fachbereich prüft den dokumentierten Inhalt auf mögliche Fehler. Korrekturen nimmt ausschließlich der Auditor vor und reicht die korrigierten Unterlagen erneut ein.</w:t>
       </w:r>
     </w:p>
     <w:p>

</xml_diff>

<commit_message>
Diagramme im ursprünglichen Layout mit aktualisierten Inhalten
Co-Authored-By: Claude Sonnet 5.5 <noreply@anthropic.com>
Claude-Session: https://claude.ai/code/session_01WyvNodyyJRof1fHMN8ju4o
</commit_message>
<xml_diff>
--- a/CADIS_Prozessbeschreibung_bereinigt.docx
+++ b/CADIS_Prozessbeschreibung_bereinigt.docx
@@ -5482,7 +5482,7 @@
         <w:rPr/>
         <w:drawing>
           <wp:inline distT="0" distB="0" distL="0" distR="0">
-            <wp:extent cx="5676900" cy="3051175"/>
+            <wp:extent cx="5676900" cy="2620010"/>
             <wp:effectExtent l="0" t="0" r="0" b="0"/>
             <wp:docPr id="5" name="Picture" descr="Abbildung 1: Prüfzyklus und Abfolge der Prüfarten"/>
             <wp:cNvGraphicFramePr>
@@ -5506,7 +5506,7 @@
                   <pic:spPr bwMode="auto">
                     <a:xfrm>
                       <a:off x="0" y="0"/>
-                      <a:ext cx="5676900" cy="3051175"/>
+                      <a:ext cx="5676900" cy="2620010"/>
                     </a:xfrm>
                     <a:prstGeom prst="rect">
                       <a:avLst/>
@@ -11900,7 +11900,7 @@
         <w:rPr/>
         <w:drawing>
           <wp:inline distT="0" distB="0" distL="0" distR="0">
-            <wp:extent cx="5676900" cy="5349240"/>
+            <wp:extent cx="5676900" cy="5080000"/>
             <wp:effectExtent l="0" t="0" r="0" b="0"/>
             <wp:docPr id="6" name="Image2" descr="Abbildung 2: Ablauf der Erstprüfung"/>
             <wp:cNvGraphicFramePr>
@@ -11924,7 +11924,7 @@
                   <pic:spPr bwMode="auto">
                     <a:xfrm>
                       <a:off x="0" y="0"/>
-                      <a:ext cx="5676900" cy="5349240"/>
+                      <a:ext cx="5676900" cy="5080000"/>
                     </a:xfrm>
                     <a:prstGeom prst="rect">
                       <a:avLst/>
@@ -12851,7 +12851,7 @@
         <w:rPr/>
         <w:drawing>
           <wp:inline distT="0" distB="0" distL="0" distR="0">
-            <wp:extent cx="5676900" cy="4881880"/>
+            <wp:extent cx="5676900" cy="4148455"/>
             <wp:effectExtent l="0" t="0" r="0" b="0"/>
             <wp:docPr id="7" name="Image3" descr="Abbildung 3: Ablauf der Maßnahmenplanbewertung und des Follow-Ups"/>
             <wp:cNvGraphicFramePr>
@@ -12875,7 +12875,7 @@
                   <pic:spPr bwMode="auto">
                     <a:xfrm>
                       <a:off x="0" y="0"/>
-                      <a:ext cx="5676900" cy="4881880"/>
+                      <a:ext cx="5676900" cy="4148455"/>
                     </a:xfrm>
                     <a:prstGeom prst="rect">
                       <a:avLst/>
@@ -13541,7 +13541,7 @@
         <w:rPr/>
         <w:drawing>
           <wp:inline distT="0" distB="0" distL="0" distR="0">
-            <wp:extent cx="5676900" cy="3221355"/>
+            <wp:extent cx="5676900" cy="2749550"/>
             <wp:effectExtent l="0" t="0" r="0" b="0"/>
             <wp:docPr id="8" name="Image4" descr="Abbildung 4: Ablauf der risikobasierten Überwachungsprüfung"/>
             <wp:cNvGraphicFramePr>
@@ -13565,7 +13565,7 @@
                   <pic:spPr bwMode="auto">
                     <a:xfrm>
                       <a:off x="0" y="0"/>
-                      <a:ext cx="5676900" cy="3221355"/>
+                      <a:ext cx="5676900" cy="2749550"/>
                     </a:xfrm>
                     <a:prstGeom prst="rect">
                       <a:avLst/>

</xml_diff>

<commit_message>
Legende in alle Abbildungen ergänzt
Co-Authored-By: Claude Sonnet 5.5 <noreply@anthropic.com>
Claude-Session: https://claude.ai/code/session_01WyvNodyyJRof1fHMN8ju4o
</commit_message>
<xml_diff>
--- a/CADIS_Prozessbeschreibung_bereinigt.docx
+++ b/CADIS_Prozessbeschreibung_bereinigt.docx
@@ -5482,7 +5482,7 @@
         <w:rPr/>
         <w:drawing>
           <wp:inline distT="0" distB="0" distL="0" distR="0">
-            <wp:extent cx="5676900" cy="2620010"/>
+            <wp:extent cx="5676900" cy="2889250"/>
             <wp:effectExtent l="0" t="0" r="0" b="0"/>
             <wp:docPr id="5" name="Picture" descr="Abbildung 1: Prüfzyklus und Abfolge der Prüfarten"/>
             <wp:cNvGraphicFramePr>
@@ -5506,7 +5506,7 @@
                   <pic:spPr bwMode="auto">
                     <a:xfrm>
                       <a:off x="0" y="0"/>
-                      <a:ext cx="5676900" cy="2620010"/>
+                      <a:ext cx="5676900" cy="2889250"/>
                     </a:xfrm>
                     <a:prstGeom prst="rect">
                       <a:avLst/>
@@ -11900,7 +11900,7 @@
         <w:rPr/>
         <w:drawing>
           <wp:inline distT="0" distB="0" distL="0" distR="0">
-            <wp:extent cx="5676900" cy="5080000"/>
+            <wp:extent cx="5676900" cy="5349240"/>
             <wp:effectExtent l="0" t="0" r="0" b="0"/>
             <wp:docPr id="6" name="Image2" descr="Abbildung 2: Ablauf der Erstprüfung"/>
             <wp:cNvGraphicFramePr>
@@ -11924,7 +11924,7 @@
                   <pic:spPr bwMode="auto">
                     <a:xfrm>
                       <a:off x="0" y="0"/>
-                      <a:ext cx="5676900" cy="5080000"/>
+                      <a:ext cx="5676900" cy="5349240"/>
                     </a:xfrm>
                     <a:prstGeom prst="rect">
                       <a:avLst/>
@@ -12851,7 +12851,7 @@
         <w:rPr/>
         <w:drawing>
           <wp:inline distT="0" distB="0" distL="0" distR="0">
-            <wp:extent cx="5676900" cy="4148455"/>
+            <wp:extent cx="5676900" cy="4419600"/>
             <wp:effectExtent l="0" t="0" r="0" b="0"/>
             <wp:docPr id="7" name="Image3" descr="Abbildung 3: Ablauf der Maßnahmenplanbewertung und des Follow-Ups"/>
             <wp:cNvGraphicFramePr>
@@ -12875,7 +12875,7 @@
                   <pic:spPr bwMode="auto">
                     <a:xfrm>
                       <a:off x="0" y="0"/>
-                      <a:ext cx="5676900" cy="4148455"/>
+                      <a:ext cx="5676900" cy="4419600"/>
                     </a:xfrm>
                     <a:prstGeom prst="rect">
                       <a:avLst/>
@@ -13541,7 +13541,7 @@
         <w:rPr/>
         <w:drawing>
           <wp:inline distT="0" distB="0" distL="0" distR="0">
-            <wp:extent cx="5676900" cy="2749550"/>
+            <wp:extent cx="5676900" cy="3018790"/>
             <wp:effectExtent l="0" t="0" r="0" b="0"/>
             <wp:docPr id="8" name="Image4" descr="Abbildung 4: Ablauf der risikobasierten Überwachungsprüfung"/>
             <wp:cNvGraphicFramePr>
@@ -13565,7 +13565,7 @@
                   <pic:spPr bwMode="auto">
                     <a:xfrm>
                       <a:off x="0" y="0"/>
-                      <a:ext cx="5676900" cy="2749550"/>
+                      <a:ext cx="5676900" cy="3018790"/>
                     </a:xfrm>
                     <a:prstGeom prst="rect">
                       <a:avLst/>

</xml_diff>

<commit_message>
Angleichung an aktualisiertes Handbuch: Berichtsfreigabe, LoE 3 Datenschutz remote, Aufsicht
Co-Authored-By: Claude Sonnet 5.5 <noreply@anthropic.com>
Claude-Session: https://claude.ai/code/session_01WyvNodyyJRof1fHMN8ju4o
</commit_message>
<xml_diff>
--- a/CADIS_Prozessbeschreibung_bereinigt.docx
+++ b/CADIS_Prozessbeschreibung_bereinigt.docx
@@ -13,7 +13,7 @@
         <mc:AlternateContent>
           <mc:Choice Requires="wps">
             <w:drawing>
-              <wp:anchor behindDoc="1" distT="0" distB="0" distL="0" distR="0" simplePos="0" locked="0" layoutInCell="0" allowOverlap="1" relativeHeight="73" wp14:anchorId="2A1C405D">
+              <wp:anchor behindDoc="1" distT="0" distB="0" distL="0" distR="0" simplePos="0" locked="0" layoutInCell="0" allowOverlap="1" relativeHeight="75" wp14:anchorId="2A1C405D">
                 <wp:simplePos x="0" y="0"/>
                 <wp:positionH relativeFrom="page">
                   <wp:posOffset>5334000</wp:posOffset>
@@ -88,7 +88,7 @@
         <mc:AlternateContent>
           <mc:Choice Requires="wps">
             <w:drawing>
-              <wp:anchor behindDoc="1" distT="0" distB="0" distL="0" distR="0" simplePos="0" locked="0" layoutInCell="0" allowOverlap="1" relativeHeight="74" wp14:anchorId="14500869">
+              <wp:anchor behindDoc="1" distT="0" distB="0" distL="0" distR="0" simplePos="0" locked="0" layoutInCell="0" allowOverlap="1" relativeHeight="76" wp14:anchorId="14500869">
                 <wp:simplePos x="0" y="0"/>
                 <wp:positionH relativeFrom="page">
                   <wp:posOffset>6223000</wp:posOffset>
@@ -147,7 +147,7 @@
         <mc:AlternateContent>
           <mc:Choice Requires="wps">
             <w:drawing>
-              <wp:anchor behindDoc="1" distT="0" distB="0" distL="0" distR="0" simplePos="0" locked="0" layoutInCell="0" allowOverlap="1" relativeHeight="75" wp14:anchorId="2EB9B489">
+              <wp:anchor behindDoc="1" distT="0" distB="0" distL="0" distR="0" simplePos="0" locked="0" layoutInCell="0" allowOverlap="1" relativeHeight="77" wp14:anchorId="2EB9B489">
                 <wp:simplePos x="0" y="0"/>
                 <wp:positionH relativeFrom="page">
                   <wp:posOffset>7112000</wp:posOffset>
@@ -4283,14 +4283,14 @@
         <w:pStyle w:val="Heading2"/>
         <w:rPr/>
       </w:pPr>
-      <w:bookmarkStart w:id="23" w:name="übersicht-der-rollen"/>
-      <w:bookmarkStart w:id="24" w:name="_Toc238102101"/>
+      <w:bookmarkStart w:id="23" w:name="_Toc238102101"/>
+      <w:bookmarkStart w:id="24" w:name="übersicht-der-rollen"/>
+      <w:bookmarkEnd w:id="24"/>
+      <w:r>
+        <w:rPr/>
+        <w:t>2.1 Übersicht der Rollen</w:t>
+      </w:r>
       <w:bookmarkEnd w:id="23"/>
-      <w:r>
-        <w:rPr/>
-        <w:t>2.1 Übersicht der Rollen</w:t>
-      </w:r>
-      <w:bookmarkEnd w:id="24"/>
     </w:p>
     <w:tbl>
       <w:tblPr>
@@ -4458,7 +4458,7 @@
                 <w:szCs w:val="19"/>
                 <w:lang w:val="de-DE" w:eastAsia="en-US" w:bidi="ar-SA"/>
               </w:rPr>
-              <w:t>Führt die Supplier Criticality Evaluation (SCE) durch, leitet LoE, Prüfmodule und Sonderanforderungen ab und erstellt den Scope-Entwurf. Stimmt Ausschlüssen aus dem Prüfscope ausdrücklich zu.</w:t>
+              <w:t>Führt die Supplier Criticality Evaluation (SCE) durch, leitet LoE, Prüfmodule und Sonderanforderungen ab und erstellt den Scope-Entwurf. Stimmt Ausschlüssen aus dem Prüfscope ausdrücklich zu. Wirkt an der Aufsicht über die Auditoren mit.</w:t>
             </w:r>
           </w:p>
         </w:tc>
@@ -4596,7 +4596,7 @@
                 <w:szCs w:val="19"/>
                 <w:lang w:val="de-DE" w:eastAsia="en-US" w:bidi="ar-SA"/>
               </w:rPr>
-              <w:t>Nimmt Aufträge an, weist Auditoren zu, erstellt die Prüfberichte und führt deren Qualitätssicherung durch, pflegt die CADIS®-Datenbank, erteilt Freigaben, überwacht Fristen und bearbeitet Einsprüche und Beschwerden.</w:t>
+              <w:t>Nimmt Aufträge an, weist Auditoren zu, erstellt die Prüfberichte und führt deren Qualitätssicherung durch, pflegt die CADIS®-Datenbank, erteilt Freigaben, überwacht Fristen und bearbeitet Einsprüche und Beschwerden. Übt gemeinsam mit den Systemherstellern die Aufsicht über die Auditoren aus.</w:t>
             </w:r>
           </w:p>
         </w:tc>
@@ -4993,7 +4993,7 @@
                 <w:szCs w:val="19"/>
                 <w:lang w:val="de-DE" w:eastAsia="en-US" w:bidi="ar-SA"/>
               </w:rPr>
-              <w:t>Vor Ort</w:t>
+              <w:t>Vor Ort (Datenschutz remote möglich)</w:t>
             </w:r>
           </w:p>
         </w:tc>
@@ -5335,7 +5335,7 @@
       </w:r>
       <w:r>
         <w:rPr/>
-        <w:t>Der Lead Auditor erstellt eine Modulzuordnung, aus der hervorgeht, welcher Auditor welche Prüfmodule je Standort und Level of Examination prüft. Jeder Auditor wird nur für Prüfmodule eingesetzt, für die er nach CADIS®-Handbuch, Kapitel 5.2, qualifiziert ist; jedes Prüfmodul hat genau einen verantwortlichen Auditor. Die Modulzuordnung wird dem CADIS®-Fachbereich zur Kenntnis gegeben, im Kick-Off (Schritt 04) dem geprüften Unternehmen vorgestellt und ist Bestandteil der Auditdokumentation.</w:t>
+        <w:t>Der Lead Auditor erstellt eine Modulzuordnung, aus der hervorgeht, welcher Auditor welche Prüfmodule je Standort und Level of Examination prüft. Jeder Auditor wird nur für Prüfmodule eingesetzt, für die er nach CADIS®-Handbuch, Kapitel 5.2, qualifiziert ist; jedes Prüfmodul hat genau einen verantwortlichen Auditor. Die Modulzuordnung wird dem CADIS®-Fachbereich zur Kenntnis gegeben, im Kick-Off (Schritt 04) dem geprüften Unternehmen vorgestellt und ist Bestandteil der Auditdokumentation. Bei LoE 3 kann das Prüfmodul „Datenschutz“ durch einen Fachauditor remote geprüft werden (CADIS®-Handbuch, Kapitel 10.5.2).</w:t>
       </w:r>
     </w:p>
     <w:p>
@@ -8433,7 +8433,7 @@
                 <w:szCs w:val="19"/>
                 <w:lang w:val="de-DE" w:eastAsia="en-US" w:bidi="ar-SA"/>
               </w:rPr>
-              <w:t>Vor-Ort-Audit: Interviews, Einsichtnahmen und Stichproben, Begehungen</w:t>
+              <w:t>Vor-Ort-Audit: Interviews, Einsichtnahmen und Stichproben, Begehungen; das Prüfmodul „Datenschutz“ darf remote geprüft werden</w:t>
             </w:r>
           </w:p>
         </w:tc>
@@ -8497,7 +8497,7 @@
                 <w:szCs w:val="19"/>
                 <w:lang w:val="de-DE" w:eastAsia="en-US" w:bidi="ar-SA"/>
               </w:rPr>
-              <w:t>Vor Ort</w:t>
+              <w:t>Vor Ort (Datenschutz remote möglich)</w:t>
             </w:r>
           </w:p>
         </w:tc>
@@ -12048,7 +12048,7 @@
       </w:pPr>
       <w:r>
         <w:rPr/>
-        <w:t>Das zu prüfende Unternehmen beauftragt die Prüfung beim CADIS®-Fachbereich. Der Fachbereich nimmt den Auftrag an, prüft den Scope-Entwurf auf Vollständigkeit und Plausibilität und weist einen Auditor zu. Deckt ein einzelner Auditor nicht alle Prüfmodule ab, wird ein Auditteam zusammengestellt. Der Fachbereich koordiniert den zeitlichen Rahmen der Prüfung mit dem Unternehmen und legt den Vorgang in der CADIS®-Datenbank an. Bei einem Auditteam benennt der CADIS®-Fachbereich einen Lead Auditor (Kapitel 2.3).</w:t>
+        <w:t>Das zu prüfende Unternehmen beauftragt die Prüfung beim CADIS®-Fachbereich. Der Fachbereich nimmt den Auftrag an, prüft den Scope-Entwurf auf Vollständigkeit und Plausibilität und weist einen Auditor zu. Deckt ein einzelner Auditor nicht alle Prüfmodule ab, wird ein Auditteam zusammengestellt oder ein Auditor zugewiesen, der alle erforderlichen Qualifikationen erfüllt. Der Fachbereich koordiniert den zeitlichen Rahmen der Prüfung mit dem Unternehmen und legt den Vorgang in der CADIS®-Datenbank an. Bei einem Auditteam benennt der CADIS®-Fachbereich einen Lead Auditor (Kapitel 2.3).</w:t>
       </w:r>
     </w:p>
     <w:p>
@@ -12132,7 +12132,7 @@
         <w:br/>
         <w:t>e) Erläuterung der Erwartungen an Form und Qualität der Selbsteinschätzung und der Nachweise,</w:t>
         <w:br/>
-        <w:t>f) Abstimmung und Bestätigung der vorab erstellten Prüfagenda (nur LoE 2 und LoE 3) und der Zeitplanung,</w:t>
+        <w:t>f) Abstimmung und Bestätigung der vorab erstellten Prüfagenda (nur LoE 2 und LoE 3) und der Zeitplanung, bei LoE 3 einschließlich der Aufteilung zwischen Vor-Ort- und Remote-Anteilen,</w:t>
         <w:br/>
         <w:t>g) Hinweis auf das Einspruchs- und Beschwerdeverfahren.</w:t>
       </w:r>
@@ -12180,7 +12180,7 @@
       </w:pPr>
       <w:r>
         <w:rPr/>
-        <w:t>Der Entwurf der Prüfagenda wird vom Auditor nach Schritt 03 und vor dem Kick-Off erstellt und im Kick-Off (Schritt 04 f) abgestimmt. Dieser Schritt umfasst die Anpassung und Bestätigung der finalen Agenda. Der Auditor erstellt bereits vor dem Kick-Off auf Basis des Scope-Entwurfs und des beauftragten Level of Examination einen Entwurf der Prüfagenda und ermittelt die erforderliche Auditzeit (CADIS® Auditplan Generator). Der Entwurf wird im Kick-Off abgestimmt und bestätigt (Schritt 04 f). Ergeben sich im Kick-Off Änderungen, passt der Auditor die Agenda unverzüglich an und übermittelt sie dem geprüften Unternehmen erneut. Die Agenda benennt Prüfabschnitte, Zeitfenster, erforderliche Ansprechpartner und – bei LoE 3 – Begehungsbereiche. Eine Agenda ist ausschließlich für Prüfungen der Stufen LoE 2 und LoE 3 zu erstellen; für LoE 1 entfällt diese Anforderung. Die Agenda ist Bestandteil der Prüfdokumentation. Bei einem Auditteam berücksichtigt die Agenda die Einsatzzeiten der Teammitglieder je Prüfmodul.</w:t>
+        <w:t>Der Entwurf der Prüfagenda wird vom Auditor nach Schritt 03 und vor dem Kick-Off erstellt und im Kick-Off (Schritt 04 f) abgestimmt. Dieser Schritt umfasst die Anpassung und Bestätigung der finalen Agenda. Der Auditor erstellt bereits vor dem Kick-Off auf Basis des Scope-Entwurfs und des beauftragten Level of Examination einen Entwurf der Prüfagenda und ermittelt die erforderliche Auditzeit (CADIS® Auditplan Generator). Der Entwurf wird im Kick-Off abgestimmt und bestätigt (Schritt 04 f). Ergeben sich im Kick-Off Änderungen, passt der Auditor die Agenda unverzüglich an und übermittelt sie dem geprüften Unternehmen erneut. Die Agenda benennt Prüfabschnitte, Zeitfenster, erforderliche Ansprechpartner und – bei LoE 3 – Begehungsbereiche. Eine Agenda ist ausschließlich für Prüfungen der Stufen LoE 2 und LoE 3 zu erstellen; für LoE 1 entfällt diese Anforderung. Die Agenda ist Bestandteil der Prüfdokumentation. Bei einem Auditteam berücksichtigt die Agenda die Einsatzzeiten der Teammitglieder je Prüfmodul. Bei LoE 3 legt die Agenda die Aufteilung zwischen Vor-Ort- und Remote-Anteilen fest (CADIS®-Handbuch, Kapitel 10.5.2).</w:t>
       </w:r>
     </w:p>
     <w:p>
@@ -12387,7 +12387,7 @@
       </w:r>
       <w:r>
         <w:rPr/>
-        <w:t xml:space="preserve"> Der Auditor prüft am Standort systematisch und evidenzbasiert: Interviews mit verantwortlichen Funktionen und ausgewählten Mitarbeitenden, Einsichtnahmen und Stichproben in operative Nachweise sowie Begehungen und Beobachtungen zur Verifikation physischer und organisatorischer Sicherheitsmaßnahmen.</w:t>
+        <w:t xml:space="preserve"> Der Auditor prüft am Standort systematisch und evidenzbasiert: Interviews mit verantwortlichen Funktionen und ausgewählten Mitarbeitenden, Einsichtnahmen und Stichproben in operative Nachweise sowie Begehungen und Beobachtungen zur Verifikation physischer und organisatorischer Sicherheitsmaßnahmen. Das Prüfmodul „Datenschutz“ darf remote durchgeführt werden, insbesondere bei Prüfung durch einen Fachauditor; alle übrigen Prüfmodule und die Standortbegehung erfolgen vor Ort (CADIS®-Handbuch, Kapitel 10.5.2). Prüftiefe und Nachweisanforderungen bleiben unverändert; für Remote-Anteile sind gesicherte Kommunikationswege zu verwenden.</w:t>
       </w:r>
     </w:p>
     <w:p>
@@ -12486,7 +12486,7 @@
       </w:pPr>
       <w:r>
         <w:rPr/>
-        <w:t>Das Closing Meeting findet am letzten Tag der Prüfung statt und bildet den formalen Abschluss der Prüfung. In begründeten Ausnahmefällen, insbesondere bei einem Remote-Closing-Meeting oder einer größeren Teilnehmerrunde, findet das Closing Meeting zeitnah nach dem letzten Prüfungstag statt, spätestens jedoch 7 Kalendertage danach; die Abweichung ist zu dokumentieren. Die Fristen beginnen mit dem tatsächlichen Tag des Closing Meetings. Der Auditor stellt die wesentlichen Ergebnisse vor und erläutert die Prüfeinstufung sowie die relevanten Feststellungen. Im Closing Meeting werden abgestimmt:</w:t>
+        <w:t>Das Closing Meeting findet am letzten Tag der Prüfung statt und bildet den formalen Abschluss der Prüfung. In begründeten Ausnahmefällen, insbesondere bei einem Remote-Closing-Meeting oder einer größeren Teilnehmerrunde, findet das Closing Meeting zeitnah nach dem letzten Prüfungstag statt, spätestens jedoch 7 Kalendertage danach; die Abweichung ist schriftlich zu begründen und durch den CADIS®-Fachbereich freizugeben (CADIS®-Handbuch, Kapitel 1.1). Die Fristen beginnen mit dem tatsächlichen Tag des Closing Meetings. Der Auditor stellt die wesentlichen Ergebnisse vor und erläutert die Prüfeinstufung sowie die relevanten Feststellungen. Im Closing Meeting werden abgestimmt:</w:t>
         <w:br/>
         <w:t>a) die Anforderungen an einen gegebenenfalls erforderlichen Maßnahmenplan einschließlich Verantwortlichkeiten, Fristen und Nachweisführung,</w:t>
         <w:br/>
@@ -12548,7 +12548,7 @@
       </w:pPr>
       <w:r>
         <w:rPr/>
-        <w:t>Veto-Prüfung: Die Qualitätssicherung des Prüfberichts durch den CADIS®-Fachbereich erfolgt als Veto-Prüfung. Hierzu reicht der Auditor (bei einem Auditteam: der Lead Auditor) vor der Qualitätssicherung folgende Unterlagen über seinen TeamBeam-Account beim CADIS®-Fachbereich (CADIS@dekra.com) ein: a) den ausgefüllten CADIS®-Prüfkatalog, b) die JSON-Datei aus dem CADIS®-Audittool, c) das Kick-Off-Material, d) die Bestätigungsmail (gemäß den CADIS®-Mailvorlagen, Handbuch Kapitel 14.1). Der CADIS®-Fachbereich prüft den dokumentierten Inhalt auf mögliche Fehler. Korrekturen nimmt ausschließlich der Auditor vor und reicht die korrigierten Unterlagen erneut ein.</w:t>
+        <w:t>Veto-Prüfung: Die Qualitätssicherung des Prüfberichts durch den CADIS®-Fachbereich erfolgt als Veto-Prüfung. Hierzu reicht der Auditor (bei einem Auditteam: der Lead Auditor) vor der Qualitätssicherung folgende Unterlagen über seinen TeamBeam-Account beim CADIS®-Fachbereich (CADIS@dekra.com) ein: a) den ausgefüllten CADIS®-Prüfkatalog, b) die JSON-Datei aus dem CADIS®-Audittool, c) das Kick-Off-Material, d) die Bestätigungsmail (gemäß den CADIS®-Mailvorlagen, Handbuch Kapitel 14.1). Jeder Prüfbericht wird durch den CADIS®-Fachbereich geprüft und muss von ihm freigegeben werden. Der Fachbereich prüft dazu den dokumentierten Inhalt auf mögliche Fehler. Korrekturen nimmt ausschließlich der Auditor vor und reicht die korrigierten Unterlagen erneut ein.</w:t>
       </w:r>
     </w:p>
     <w:p>
@@ -13382,7 +13382,7 @@
       </w:pPr>
       <w:r>
         <w:rPr/>
-        <w:t>Der Auditor dokumentiert das Ergebnis des Follow-Ups im CADIS®-Audittool. Der CADIS®-Fachbereich aktualisiert den Status in der CADIS®-Datenbank und passt die Freigabe an. Sind alle Abweichungen geschlossen, kann die Einstufung auf „konform“ heraufgestuft und die Freigabe erteilt werden. Verbleiben Abweichungen, ist innerhalb der geltenden Frist ein weiteres Follow-Up durchzuführen. Wird eine kritische Abweichung begründet herabgestuft und verbleiben nur nicht kritische Abweichungen, wird die Einstufung auf „nicht kritisch abweichend“ geändert und eine temporäre Freigabe erteilt. Die Schließung hat bis zur risikobasierten Überwachungsprüfung zu erfolgen (in der Überwachungsprüfung innerhalb der Gesamtfrist nach Schritt Ü-05 a)).</w:t>
+        <w:t>Der Auditor dokumentiert das Ergebnis des Follow-Ups im CADIS®-Audittool. Der CADIS®-Fachbereich aktualisiert den Status in der CADIS®-Datenbank und passt die Freigabe an. Sind alle Abweichungen geschlossen, kann die Einstufung auf „konform“ heraufgestuft und die Freigabe erteilt werden. Verbleiben Abweichungen, ist innerhalb der geltenden Frist ein weiteres Follow-Up durchzuführen. Wird eine kritische Abweichung begründet herabgestuft und verbleiben nur nicht kritische Abweichungen, wird die Einstufung auf „nicht kritisch abweichend“ geändert und eine temporäre Freigabe erteilt. Die Schließung hat bis zur risikobasierten Überwachungsprüfung zu erfolgen (in der Überwachungsprüfung innerhalb der Gesamtfrist nach Schritt Ü-05 a)). Auch der Follow-Up-Bericht wird durch den CADIS®-Fachbereich geprüft und muss von ihm freigegeben werden; die Unterlagen für die Veto-Prüfung sind entsprechend Schritt 11 einzureichen.</w:t>
       </w:r>
     </w:p>
     <w:p>
@@ -14232,7 +14232,7 @@
       </w:pPr>
       <w:r>
         <w:rPr/>
-        <w:t>Umfasst der Prüfscope mehrere Standorte, gelten zusätzlich die Regelungen des CADIS®-Handbuchs, Kapitel 11. Sie betreffen insbesondere die Voraussetzungen für den Multi-Site-Ansatz, die Klassifizierung des Hauptstandorts, die Stichprobenberechnung, die risikobasierte Stichprobenauswahl, die standortbezogene Prüfpunktauswahl, die Erweiterung der Stichprobe sowie die Ergebnisdarstellung. Der in Kapitel 4.1.2 beschriebene Ablauf bleibt davon unberührt; die Schritte 05 bis 09 sind je Standort beziehungsweise je Stichprobe anzuwenden, wobei Schritt 05 nur bei LoE 2 und LoE 3 zur Anwendung kommt. Innerhalb eines Prüfscopes gelten für alle Standorte dieselben Prüfmodule und Prüfziele; ein standortabhängig unterschiedlicher Prüfumfang ist nicht zulässig. Die risikobasierte Stichprobenauswahl bestimmt ausschließlich, welche Standorte in welchem Umfang geprüft werden, nicht welche Prüfmodule anzuwenden sind. Je Standort gelten die Stufen der Sonderanforderungen, die dem dort angewendeten Level of Examination zugeordnet sind. Der Multi-Site-Ansatz setzt mindestens zwei Standorte voraus; seine Anwendbarkeit wird im Scopingprozess vor dem Kick-Off festgestellt.</w:t>
+        <w:t>Umfasst der Prüfscope mehrere Standorte, gelten zusätzlich die Regelungen des CADIS®-Handbuchs, Kapitel 11. Sie betreffen insbesondere die Voraussetzungen für den Multi-Site-Ansatz, die Klassifizierung des Hauptstandorts, die Stichprobenberechnung, die risikobasierte Stichprobenauswahl, die standortbezogene Prüfpunktauswahl, die Erweiterung der Stichprobe sowie die Ergebnisdarstellung. Der in Kapitel 4.1.2 beschriebene Ablauf bleibt davon unberührt; die Schritte 05 bis 09 sind je Standort beziehungsweise je Stichprobe anzuwenden, wobei Schritt 05 nur bei LoE 2 und LoE 3 zur Anwendung kommt. Innerhalb eines Prüfscopes gelten für alle Standorte dieselben Prüfmodule und Prüfziele; ein standortabhängig unterschiedlicher Prüfumfang ist nicht zulässig. Die risikobasierte Stichprobenauswahl bestimmt ausschließlich, welche Standorte in welchem Umfang geprüft werden, nicht welche Prüfmodule anzuwenden sind. Je Standort gelten die Stufen der Sonderanforderungen, die dem dort angewendeten Level of Examination zugeordnet sind. Der Multi-Site-Ansatz setzt mindestens zwei Standorte voraus; seine Anwendbarkeit wird im Scopingprozess vor dem Kick-Off festgestellt. Bei LoE 3 gelten die Regelungen zu Remote-Anteilen (Schritt 08) entsprechend.</w:t>
       </w:r>
     </w:p>
     <w:p>
@@ -15697,7 +15697,7 @@
                   <w:rFonts w:eastAsia="Noto Sans" w:cs=""/>
                   <w:lang w:val="de-DE" w:eastAsia="en-US" w:bidi="ar-SA"/>
                 </w:rPr>
-                <w:t>34</w:t>
+                <w:t>35</w:t>
               </w:r>
               <w:r>
                 <w:rPr>
@@ -15745,7 +15745,7 @@
                   <w:rFonts w:eastAsia="Noto Sans" w:cs=""/>
                   <w:lang w:val="de-DE" w:eastAsia="en-US" w:bidi="ar-SA"/>
                 </w:rPr>
-                <w:t>34</w:t>
+                <w:t>35</w:t>
               </w:r>
               <w:r>
                 <w:rPr>
@@ -15839,7 +15839,7 @@
     <w:r>
       <w:rPr/>
       <w:drawing>
-        <wp:anchor behindDoc="1" distT="0" distB="0" distL="0" distR="0" simplePos="0" locked="0" layoutInCell="0" allowOverlap="1" relativeHeight="38">
+        <wp:anchor behindDoc="1" distT="0" distB="0" distL="0" distR="0" simplePos="0" locked="0" layoutInCell="0" allowOverlap="1" relativeHeight="39">
           <wp:simplePos x="0" y="0"/>
           <wp:positionH relativeFrom="page">
             <wp:posOffset>-342265</wp:posOffset>
@@ -15884,7 +15884,7 @@
         </wp:anchor>
       </w:drawing>
       <w:drawing>
-        <wp:anchor behindDoc="1" distT="0" distB="0" distL="0" distR="0" simplePos="0" locked="0" layoutInCell="0" allowOverlap="1" relativeHeight="72">
+        <wp:anchor behindDoc="1" distT="0" distB="0" distL="0" distR="0" simplePos="0" locked="0" layoutInCell="0" allowOverlap="1" relativeHeight="74">
           <wp:simplePos x="0" y="0"/>
           <wp:positionH relativeFrom="page">
             <wp:posOffset>5581015</wp:posOffset>

</xml_diff>

<commit_message>
Handbuch 6.2: Kick-Off bei Überwachung und Follow-Up nicht zwingend, Abstimmung mit Kunde; Prozess angeglichen
Co-Authored-By: Claude Sonnet 5.5 <noreply@anthropic.com>
Claude-Session: https://claude.ai/code/session_01WyvNodyyJRof1fHMN8ju4o
</commit_message>
<xml_diff>
--- a/CADIS_Prozessbeschreibung_bereinigt.docx
+++ b/CADIS_Prozessbeschreibung_bereinigt.docx
@@ -13346,7 +13346,7 @@
       </w:pPr>
       <w:r>
         <w:rPr/>
-        <w:t>Der Auditor prüft, ob die umgesetzten Korrekturmaßnahmen geeignet sind, die festgestellten Abweichungen wirksam abzustellen. Je Abweichung wird eines der folgenden Ergebnisse dokumentiert: behoben, herabgestuft auf nicht kritische Abweichung, nicht kritische Abweichung verbleibt oder kritische Abweichung verbleibt. Eine Herabstufung ist nur zulässig, wenn das unmittelbare Risiko nachweislich beseitigt ist; die Kriterien sind im CADIS®-Handbuch, Kapitel 7.2, festgelegt. Absichtserklärungen oder reine Planungen genügen nicht. Das Follow-Up muss dasselbe Maß an Nachvollziehbarkeit bieten wie die zugrunde liegende Prüfung; die Wahl der Methode liegt im Ermessen des Auditors.</w:t>
+        <w:t>Der Auditor prüft, ob die umgesetzten Korrekturmaßnahmen geeignet sind, die festgestellten Abweichungen wirksam abzustellen. Je Abweichung wird eines der folgenden Ergebnisse dokumentiert: behoben, herabgestuft auf nicht kritische Abweichung, nicht kritische Abweichung verbleibt oder kritische Abweichung verbleibt. Eine Herabstufung ist nur zulässig, wenn das unmittelbare Risiko nachweislich beseitigt ist; die Kriterien sind im CADIS®-Handbuch, Kapitel 7.2, festgelegt. Absichtserklärungen oder reine Planungen genügen nicht. Das Follow-Up muss dasselbe Maß an Nachvollziehbarkeit bieten wie die zugrunde liegende Prüfung; die Wahl der Methode liegt im Ermessen des Auditors. Ein Kick-Off ist nicht zwingend erforderlich (CADIS®-Handbuch, Kapitel 6.2); der Auditor stimmt jedoch Termin, Ansprechpartner und Form der Verifizierung vorab mit dem geprüften Unternehmen ab.</w:t>
       </w:r>
     </w:p>
     <w:p>
@@ -13732,7 +13732,7 @@
       </w:pPr>
       <w:r>
         <w:rPr/>
-        <w:t>Die Überwachungsprüfung wird in der Methodik des für den Prüfscope festgelegten Level of Examination durchgeführt. Der Ablauf entspricht den Schritten 06 bis 08 der Erstprüfung, bezogen auf die risikobasiert ausgewählten Prüffragen zuzüglich der offenen Abweichungen aus der vorangegangenen Prüfung; Standorte, Prüfmodule und LoE werden gegenüber der Erstprüfung nicht reduziert. Die Überwachungsprüfung kann mit einer Erweiterungsprüfung kombiniert werden (Kapitel 5.1.3). Ein Kick-Off ist nicht erforderlich; der Auditor stimmt jedoch Termin, Ansprechpartner und – bei LoE 2 und LoE 3 – die Prüfagenda vorab mit dem geprüften Unternehmen ab. Im Anschluss an die Bewertung (Schritt Ü-05) findet das Closing Meeting entsprechend Schritt 10 der Erstprüfung statt.</w:t>
+        <w:t>Die Überwachungsprüfung wird in der Methodik des für den Prüfscope festgelegten Level of Examination durchgeführt. Der Ablauf entspricht den Schritten 06 bis 08 der Erstprüfung, bezogen auf die risikobasiert ausgewählten Prüffragen zuzüglich der offenen Abweichungen aus der vorangegangenen Prüfung; Standorte, Prüfmodule und LoE werden gegenüber der Erstprüfung nicht reduziert. Die Überwachungsprüfung kann mit einer Erweiterungsprüfung kombiniert werden (Kapitel 5.1.3). Ein Kick-Off ist nicht zwingend erforderlich (CADIS®-Handbuch, Kapitel 6.2); der Auditor stimmt jedoch Termin, Ansprechpartner und – bei LoE 2 und LoE 3 – die Prüfagenda vorab mit dem geprüften Unternehmen ab. Im Anschluss an die Bewertung (Schritt Ü-05) findet das Closing Meeting entsprechend Schritt 10 der Erstprüfung statt.</w:t>
       </w:r>
     </w:p>
     <w:p>

</xml_diff>